<commit_message>
in documentation +Organ ui
</commit_message>
<xml_diff>
--- a/Documentation/Documentation.docx
+++ b/Documentation/Documentation.docx
@@ -134,35 +134,40 @@
     <w:p>
       <w:pPr>
         <w:jc w:val="center"/>
-      </w:pPr>
-      <w:r>
+        <w:rPr>
+          <w:sz w:val="28"/>
+          <w:lang w:val="en-US"/>
+        </w:rPr>
+      </w:pPr>
+      <w:r>
+        <w:rPr>
+          <w:lang w:val="en-US"/>
+        </w:rPr>
         <w:t xml:space="preserve">Toni </w:t>
       </w:r>
       <w:proofErr w:type="spellStart"/>
       <w:r>
+        <w:rPr>
+          <w:lang w:val="en-US"/>
+        </w:rPr>
         <w:t>Kostov</w:t>
       </w:r>
       <w:proofErr w:type="spellEnd"/>
       <w:r>
+        <w:rPr>
+          <w:lang w:val="en-US"/>
+        </w:rPr>
         <w:br w:type="page"/>
       </w:r>
-      <w:r>
+      <w:bookmarkStart w:id="0" w:name="_GoBack"/>
+      <w:r>
+        <w:rPr>
+          <w:sz w:val="28"/>
+          <w:lang w:val="en-US"/>
+        </w:rPr>
         <w:lastRenderedPageBreak/>
-        <w:t xml:space="preserve">Table </w:t>
-      </w:r>
-      <w:proofErr w:type="spellStart"/>
-      <w:r>
-        <w:t>of</w:t>
-      </w:r>
-      <w:proofErr w:type="spellEnd"/>
-      <w:r>
-        <w:t xml:space="preserve"> </w:t>
-      </w:r>
-      <w:proofErr w:type="spellStart"/>
-      <w:r>
-        <w:t>contents</w:t>
-      </w:r>
-      <w:proofErr w:type="spellEnd"/>
+        <w:t>Table of contents</w:t>
+      </w:r>
     </w:p>
     <w:p>
       <w:pPr>
@@ -175,25 +180,34 @@
           <w:rFonts w:asciiTheme="minorHAnsi" w:eastAsiaTheme="minorEastAsia" w:hAnsiTheme="minorHAnsi" w:cstheme="minorBidi"/>
           <w:noProof/>
           <w:kern w:val="0"/>
-          <w:sz w:val="22"/>
           <w:szCs w:val="22"/>
           <w:lang w:val="ru-RU" w:eastAsia="ru-RU"/>
         </w:rPr>
       </w:pPr>
       <w:r>
+        <w:rPr>
+          <w:sz w:val="28"/>
+        </w:rPr>
         <w:fldChar w:fldCharType="begin"/>
       </w:r>
       <w:r>
+        <w:rPr>
+          <w:sz w:val="28"/>
+        </w:rPr>
         <w:instrText xml:space="preserve"> TOC \o "1 - 3" \z \h </w:instrText>
       </w:r>
       <w:r>
+        <w:rPr>
+          <w:sz w:val="28"/>
+        </w:rPr>
         <w:fldChar w:fldCharType="separate"/>
       </w:r>
-      <w:hyperlink w:anchor="_Toc172724896" w:history="1">
+      <w:hyperlink w:anchor="_Toc172725607" w:history="1">
         <w:r>
           <w:rPr>
             <w:rStyle w:val="a6"/>
             <w:noProof/>
+            <w:sz w:val="28"/>
           </w:rPr>
           <w:t>1.</w:t>
         </w:r>
@@ -202,7 +216,6 @@
             <w:rFonts w:asciiTheme="minorHAnsi" w:eastAsiaTheme="minorEastAsia" w:hAnsiTheme="minorHAnsi" w:cstheme="minorBidi"/>
             <w:noProof/>
             <w:kern w:val="0"/>
-            <w:sz w:val="22"/>
             <w:szCs w:val="22"/>
             <w:lang w:val="ru-RU" w:eastAsia="ru-RU"/>
           </w:rPr>
@@ -212,6 +225,7 @@
           <w:rPr>
             <w:rStyle w:val="a6"/>
             <w:noProof/>
+            <w:sz w:val="28"/>
           </w:rPr>
           <w:t>Motivation and goal setting</w:t>
         </w:r>
@@ -219,6 +233,7 @@
           <w:rPr>
             <w:noProof/>
             <w:webHidden/>
+            <w:sz w:val="28"/>
           </w:rPr>
           <w:tab/>
         </w:r>
@@ -226,6 +241,7 @@
           <w:rPr>
             <w:noProof/>
             <w:webHidden/>
+            <w:sz w:val="28"/>
           </w:rPr>
           <w:fldChar w:fldCharType="begin"/>
         </w:r>
@@ -233,19 +249,22 @@
           <w:rPr>
             <w:noProof/>
             <w:webHidden/>
+            <w:sz w:val="28"/>
           </w:rPr>
-          <w:instrText xml:space="preserve"> PAGEREF _Toc172724896 \h </w:instrText>
+          <w:instrText xml:space="preserve"> PAGEREF _Toc172725607 \h </w:instrText>
         </w:r>
         <w:r>
           <w:rPr>
             <w:noProof/>
             <w:webHidden/>
+            <w:sz w:val="28"/>
           </w:rPr>
         </w:r>
         <w:r>
           <w:rPr>
             <w:noProof/>
             <w:webHidden/>
+            <w:sz w:val="28"/>
           </w:rPr>
           <w:fldChar w:fldCharType="separate"/>
         </w:r>
@@ -253,6 +272,7 @@
           <w:rPr>
             <w:noProof/>
             <w:webHidden/>
+            <w:sz w:val="28"/>
           </w:rPr>
           <w:t>1</w:t>
         </w:r>
@@ -260,6 +280,7 @@
           <w:rPr>
             <w:noProof/>
             <w:webHidden/>
+            <w:sz w:val="28"/>
           </w:rPr>
           <w:fldChar w:fldCharType="end"/>
         </w:r>
@@ -276,17 +297,17 @@
           <w:rFonts w:asciiTheme="minorHAnsi" w:eastAsiaTheme="minorEastAsia" w:hAnsiTheme="minorHAnsi" w:cstheme="minorBidi"/>
           <w:noProof/>
           <w:kern w:val="0"/>
-          <w:sz w:val="22"/>
           <w:szCs w:val="22"/>
           <w:lang w:val="ru-RU" w:eastAsia="ru-RU"/>
         </w:rPr>
       </w:pPr>
-      <w:hyperlink w:anchor="_Toc172724897" w:history="1">
+      <w:hyperlink w:anchor="_Toc172725608" w:history="1">
         <w:r>
           <w:rPr>
             <w:rStyle w:val="a6"/>
             <w:i/>
             <w:noProof/>
+            <w:sz w:val="28"/>
             <w:lang w:val="ru-RU"/>
           </w:rPr>
           <w:t>2.</w:t>
@@ -296,7 +317,6 @@
             <w:rFonts w:asciiTheme="minorHAnsi" w:eastAsiaTheme="minorEastAsia" w:hAnsiTheme="minorHAnsi" w:cstheme="minorBidi"/>
             <w:noProof/>
             <w:kern w:val="0"/>
-            <w:sz w:val="22"/>
             <w:szCs w:val="22"/>
             <w:lang w:val="ru-RU" w:eastAsia="ru-RU"/>
           </w:rPr>
@@ -306,6 +326,7 @@
           <w:rPr>
             <w:rStyle w:val="a6"/>
             <w:noProof/>
+            <w:sz w:val="28"/>
             <w:lang w:val="en-US"/>
           </w:rPr>
           <w:t xml:space="preserve">Pose Estimation </w:t>
@@ -315,6 +336,7 @@
             <w:rStyle w:val="a6"/>
             <w:i/>
             <w:noProof/>
+            <w:sz w:val="28"/>
             <w:lang w:val="en-US"/>
           </w:rPr>
           <w:t>(By Atilla and Matsvei)</w:t>
@@ -323,6 +345,7 @@
           <w:rPr>
             <w:noProof/>
             <w:webHidden/>
+            <w:sz w:val="28"/>
           </w:rPr>
           <w:tab/>
         </w:r>
@@ -330,6 +353,7 @@
           <w:rPr>
             <w:noProof/>
             <w:webHidden/>
+            <w:sz w:val="28"/>
           </w:rPr>
           <w:fldChar w:fldCharType="begin"/>
         </w:r>
@@ -337,19 +361,22 @@
           <w:rPr>
             <w:noProof/>
             <w:webHidden/>
+            <w:sz w:val="28"/>
           </w:rPr>
-          <w:instrText xml:space="preserve"> PAGEREF _Toc172724897 \h </w:instrText>
+          <w:instrText xml:space="preserve"> PAGEREF _Toc172725608 \h </w:instrText>
         </w:r>
         <w:r>
           <w:rPr>
             <w:noProof/>
             <w:webHidden/>
+            <w:sz w:val="28"/>
           </w:rPr>
         </w:r>
         <w:r>
           <w:rPr>
             <w:noProof/>
             <w:webHidden/>
+            <w:sz w:val="28"/>
           </w:rPr>
           <w:fldChar w:fldCharType="separate"/>
         </w:r>
@@ -357,6 +384,7 @@
           <w:rPr>
             <w:noProof/>
             <w:webHidden/>
+            <w:sz w:val="28"/>
           </w:rPr>
           <w:t>2</w:t>
         </w:r>
@@ -364,6 +392,7 @@
           <w:rPr>
             <w:noProof/>
             <w:webHidden/>
+            <w:sz w:val="28"/>
           </w:rPr>
           <w:fldChar w:fldCharType="end"/>
         </w:r>
@@ -380,16 +409,16 @@
           <w:rFonts w:asciiTheme="minorHAnsi" w:eastAsiaTheme="minorEastAsia" w:hAnsiTheme="minorHAnsi" w:cstheme="minorBidi"/>
           <w:noProof/>
           <w:kern w:val="0"/>
-          <w:sz w:val="22"/>
           <w:szCs w:val="22"/>
           <w:lang w:val="ru-RU" w:eastAsia="ru-RU"/>
         </w:rPr>
       </w:pPr>
-      <w:hyperlink w:anchor="_Toc172724898" w:history="1">
+      <w:hyperlink w:anchor="_Toc172725609" w:history="1">
         <w:r>
           <w:rPr>
             <w:rStyle w:val="a6"/>
             <w:noProof/>
+            <w:sz w:val="28"/>
           </w:rPr>
           <w:t>2.1.</w:t>
         </w:r>
@@ -398,7 +427,6 @@
             <w:rFonts w:asciiTheme="minorHAnsi" w:eastAsiaTheme="minorEastAsia" w:hAnsiTheme="minorHAnsi" w:cstheme="minorBidi"/>
             <w:noProof/>
             <w:kern w:val="0"/>
-            <w:sz w:val="22"/>
             <w:szCs w:val="22"/>
             <w:lang w:val="ru-RU" w:eastAsia="ru-RU"/>
           </w:rPr>
@@ -408,6 +436,7 @@
           <w:rPr>
             <w:rStyle w:val="a6"/>
             <w:noProof/>
+            <w:sz w:val="28"/>
           </w:rPr>
           <w:t>Evaluation of Tested Models</w:t>
         </w:r>
@@ -415,6 +444,7 @@
           <w:rPr>
             <w:noProof/>
             <w:webHidden/>
+            <w:sz w:val="28"/>
           </w:rPr>
           <w:tab/>
         </w:r>
@@ -422,6 +452,7 @@
           <w:rPr>
             <w:noProof/>
             <w:webHidden/>
+            <w:sz w:val="28"/>
           </w:rPr>
           <w:fldChar w:fldCharType="begin"/>
         </w:r>
@@ -429,19 +460,22 @@
           <w:rPr>
             <w:noProof/>
             <w:webHidden/>
+            <w:sz w:val="28"/>
           </w:rPr>
-          <w:instrText xml:space="preserve"> PAGEREF _Toc172724898 \h </w:instrText>
+          <w:instrText xml:space="preserve"> PAGEREF _Toc172725609 \h </w:instrText>
         </w:r>
         <w:r>
           <w:rPr>
             <w:noProof/>
             <w:webHidden/>
+            <w:sz w:val="28"/>
           </w:rPr>
         </w:r>
         <w:r>
           <w:rPr>
             <w:noProof/>
             <w:webHidden/>
+            <w:sz w:val="28"/>
           </w:rPr>
           <w:fldChar w:fldCharType="separate"/>
         </w:r>
@@ -449,6 +483,7 @@
           <w:rPr>
             <w:noProof/>
             <w:webHidden/>
+            <w:sz w:val="28"/>
           </w:rPr>
           <w:t>2</w:t>
         </w:r>
@@ -456,6 +491,7 @@
           <w:rPr>
             <w:noProof/>
             <w:webHidden/>
+            <w:sz w:val="28"/>
           </w:rPr>
           <w:fldChar w:fldCharType="end"/>
         </w:r>
@@ -472,16 +508,16 @@
           <w:rFonts w:asciiTheme="minorHAnsi" w:eastAsiaTheme="minorEastAsia" w:hAnsiTheme="minorHAnsi" w:cstheme="minorBidi"/>
           <w:noProof/>
           <w:kern w:val="0"/>
-          <w:sz w:val="22"/>
           <w:szCs w:val="22"/>
           <w:lang w:val="ru-RU" w:eastAsia="ru-RU"/>
         </w:rPr>
       </w:pPr>
-      <w:hyperlink w:anchor="_Toc172724899" w:history="1">
+      <w:hyperlink w:anchor="_Toc172725610" w:history="1">
         <w:r>
           <w:rPr>
             <w:rStyle w:val="a6"/>
             <w:noProof/>
+            <w:sz w:val="28"/>
             <w:lang w:val="en-US"/>
           </w:rPr>
           <w:t>2.1.1.</w:t>
@@ -491,7 +527,6 @@
             <w:rFonts w:asciiTheme="minorHAnsi" w:eastAsiaTheme="minorEastAsia" w:hAnsiTheme="minorHAnsi" w:cstheme="minorBidi"/>
             <w:noProof/>
             <w:kern w:val="0"/>
-            <w:sz w:val="22"/>
             <w:szCs w:val="22"/>
             <w:lang w:val="ru-RU" w:eastAsia="ru-RU"/>
           </w:rPr>
@@ -501,6 +536,7 @@
           <w:rPr>
             <w:rStyle w:val="a6"/>
             <w:noProof/>
+            <w:sz w:val="28"/>
             <w:lang w:val="en-US"/>
           </w:rPr>
           <w:t>Kinect (Atilla and Matsvei)</w:t>
@@ -509,6 +545,7 @@
           <w:rPr>
             <w:noProof/>
             <w:webHidden/>
+            <w:sz w:val="28"/>
           </w:rPr>
           <w:tab/>
         </w:r>
@@ -516,6 +553,7 @@
           <w:rPr>
             <w:noProof/>
             <w:webHidden/>
+            <w:sz w:val="28"/>
           </w:rPr>
           <w:fldChar w:fldCharType="begin"/>
         </w:r>
@@ -523,19 +561,22 @@
           <w:rPr>
             <w:noProof/>
             <w:webHidden/>
+            <w:sz w:val="28"/>
           </w:rPr>
-          <w:instrText xml:space="preserve"> PAGEREF _Toc172724899 \h </w:instrText>
+          <w:instrText xml:space="preserve"> PAGEREF _Toc172725610 \h </w:instrText>
         </w:r>
         <w:r>
           <w:rPr>
             <w:noProof/>
             <w:webHidden/>
+            <w:sz w:val="28"/>
           </w:rPr>
         </w:r>
         <w:r>
           <w:rPr>
             <w:noProof/>
             <w:webHidden/>
+            <w:sz w:val="28"/>
           </w:rPr>
           <w:fldChar w:fldCharType="separate"/>
         </w:r>
@@ -543,6 +584,7 @@
           <w:rPr>
             <w:noProof/>
             <w:webHidden/>
+            <w:sz w:val="28"/>
           </w:rPr>
           <w:t>2</w:t>
         </w:r>
@@ -550,6 +592,7 @@
           <w:rPr>
             <w:noProof/>
             <w:webHidden/>
+            <w:sz w:val="28"/>
           </w:rPr>
           <w:fldChar w:fldCharType="end"/>
         </w:r>
@@ -566,16 +609,16 @@
           <w:rFonts w:asciiTheme="minorHAnsi" w:eastAsiaTheme="minorEastAsia" w:hAnsiTheme="minorHAnsi" w:cstheme="minorBidi"/>
           <w:noProof/>
           <w:kern w:val="0"/>
-          <w:sz w:val="22"/>
           <w:szCs w:val="22"/>
           <w:lang w:val="ru-RU" w:eastAsia="ru-RU"/>
         </w:rPr>
       </w:pPr>
-      <w:hyperlink w:anchor="_Toc172724900" w:history="1">
+      <w:hyperlink w:anchor="_Toc172725611" w:history="1">
         <w:r>
           <w:rPr>
             <w:rStyle w:val="a6"/>
             <w:noProof/>
+            <w:sz w:val="28"/>
             <w:lang w:val="en-US"/>
           </w:rPr>
           <w:t>2.1.2.</w:t>
@@ -585,7 +628,6 @@
             <w:rFonts w:asciiTheme="minorHAnsi" w:eastAsiaTheme="minorEastAsia" w:hAnsiTheme="minorHAnsi" w:cstheme="minorBidi"/>
             <w:noProof/>
             <w:kern w:val="0"/>
-            <w:sz w:val="22"/>
             <w:szCs w:val="22"/>
             <w:lang w:val="ru-RU" w:eastAsia="ru-RU"/>
           </w:rPr>
@@ -595,6 +637,7 @@
           <w:rPr>
             <w:rStyle w:val="a6"/>
             <w:noProof/>
+            <w:sz w:val="28"/>
             <w:lang w:val="en-US"/>
           </w:rPr>
           <w:t>Webcam-Based Pose Estimation with MoveNet (Atilla)</w:t>
@@ -603,6 +646,7 @@
           <w:rPr>
             <w:noProof/>
             <w:webHidden/>
+            <w:sz w:val="28"/>
           </w:rPr>
           <w:tab/>
         </w:r>
@@ -610,6 +654,7 @@
           <w:rPr>
             <w:noProof/>
             <w:webHidden/>
+            <w:sz w:val="28"/>
           </w:rPr>
           <w:fldChar w:fldCharType="begin"/>
         </w:r>
@@ -617,19 +662,22 @@
           <w:rPr>
             <w:noProof/>
             <w:webHidden/>
+            <w:sz w:val="28"/>
           </w:rPr>
-          <w:instrText xml:space="preserve"> PAGEREF _Toc172724900 \h </w:instrText>
+          <w:instrText xml:space="preserve"> PAGEREF _Toc172725611 \h </w:instrText>
         </w:r>
         <w:r>
           <w:rPr>
             <w:noProof/>
             <w:webHidden/>
+            <w:sz w:val="28"/>
           </w:rPr>
         </w:r>
         <w:r>
           <w:rPr>
             <w:noProof/>
             <w:webHidden/>
+            <w:sz w:val="28"/>
           </w:rPr>
           <w:fldChar w:fldCharType="separate"/>
         </w:r>
@@ -637,6 +685,7 @@
           <w:rPr>
             <w:noProof/>
             <w:webHidden/>
+            <w:sz w:val="28"/>
           </w:rPr>
           <w:t>2</w:t>
         </w:r>
@@ -644,6 +693,7 @@
           <w:rPr>
             <w:noProof/>
             <w:webHidden/>
+            <w:sz w:val="28"/>
           </w:rPr>
           <w:fldChar w:fldCharType="end"/>
         </w:r>
@@ -660,16 +710,16 @@
           <w:rFonts w:asciiTheme="minorHAnsi" w:eastAsiaTheme="minorEastAsia" w:hAnsiTheme="minorHAnsi" w:cstheme="minorBidi"/>
           <w:noProof/>
           <w:kern w:val="0"/>
-          <w:sz w:val="22"/>
           <w:szCs w:val="22"/>
           <w:lang w:val="ru-RU" w:eastAsia="ru-RU"/>
         </w:rPr>
       </w:pPr>
-      <w:hyperlink w:anchor="_Toc172724901" w:history="1">
+      <w:hyperlink w:anchor="_Toc172725612" w:history="1">
         <w:r>
           <w:rPr>
             <w:rStyle w:val="a6"/>
             <w:noProof/>
+            <w:sz w:val="28"/>
             <w:lang w:val="en-US"/>
           </w:rPr>
           <w:t>2.1.3.</w:t>
@@ -679,7 +729,6 @@
             <w:rFonts w:asciiTheme="minorHAnsi" w:eastAsiaTheme="minorEastAsia" w:hAnsiTheme="minorHAnsi" w:cstheme="minorBidi"/>
             <w:noProof/>
             <w:kern w:val="0"/>
-            <w:sz w:val="22"/>
             <w:szCs w:val="22"/>
             <w:lang w:val="ru-RU" w:eastAsia="ru-RU"/>
           </w:rPr>
@@ -689,30 +738,16 @@
           <w:rPr>
             <w:rStyle w:val="a6"/>
             <w:noProof/>
+            <w:sz w:val="28"/>
             <w:lang w:val="en-US"/>
           </w:rPr>
-          <w:t>Webca</w:t>
-        </w:r>
-        <w:r>
-          <w:rPr>
-            <w:rStyle w:val="a6"/>
-            <w:noProof/>
-            <w:lang w:val="en-US"/>
-          </w:rPr>
-          <w:t>m</w:t>
-        </w:r>
-        <w:r>
-          <w:rPr>
-            <w:rStyle w:val="a6"/>
-            <w:noProof/>
-            <w:lang w:val="en-US"/>
-          </w:rPr>
-          <w:t>-Based Hand Recognition with Mediapipe+Tensorflow (Matsvei)</w:t>
+          <w:t>Hand Recognition with Mediapipe+Tensorflow (Matsvei)</w:t>
         </w:r>
         <w:r>
           <w:rPr>
             <w:noProof/>
             <w:webHidden/>
+            <w:sz w:val="28"/>
           </w:rPr>
           <w:tab/>
         </w:r>
@@ -720,6 +755,7 @@
           <w:rPr>
             <w:noProof/>
             <w:webHidden/>
+            <w:sz w:val="28"/>
           </w:rPr>
           <w:fldChar w:fldCharType="begin"/>
         </w:r>
@@ -727,19 +763,22 @@
           <w:rPr>
             <w:noProof/>
             <w:webHidden/>
+            <w:sz w:val="28"/>
           </w:rPr>
-          <w:instrText xml:space="preserve"> PAGEREF _Toc172724901 \h </w:instrText>
+          <w:instrText xml:space="preserve"> PAGEREF _Toc172725612 \h </w:instrText>
         </w:r>
         <w:r>
           <w:rPr>
             <w:noProof/>
             <w:webHidden/>
+            <w:sz w:val="28"/>
           </w:rPr>
         </w:r>
         <w:r>
           <w:rPr>
             <w:noProof/>
             <w:webHidden/>
+            <w:sz w:val="28"/>
           </w:rPr>
           <w:fldChar w:fldCharType="separate"/>
         </w:r>
@@ -747,6 +786,7 @@
           <w:rPr>
             <w:noProof/>
             <w:webHidden/>
+            <w:sz w:val="28"/>
           </w:rPr>
           <w:t>3</w:t>
         </w:r>
@@ -754,6 +794,7 @@
           <w:rPr>
             <w:noProof/>
             <w:webHidden/>
+            <w:sz w:val="28"/>
           </w:rPr>
           <w:fldChar w:fldCharType="end"/>
         </w:r>
@@ -770,16 +811,16 @@
           <w:rFonts w:asciiTheme="minorHAnsi" w:eastAsiaTheme="minorEastAsia" w:hAnsiTheme="minorHAnsi" w:cstheme="minorBidi"/>
           <w:noProof/>
           <w:kern w:val="0"/>
-          <w:sz w:val="22"/>
           <w:szCs w:val="22"/>
           <w:lang w:val="ru-RU" w:eastAsia="ru-RU"/>
         </w:rPr>
       </w:pPr>
-      <w:hyperlink w:anchor="_Toc172724902" w:history="1">
+      <w:hyperlink w:anchor="_Toc172725613" w:history="1">
         <w:r>
           <w:rPr>
             <w:rStyle w:val="a6"/>
             <w:noProof/>
+            <w:sz w:val="28"/>
           </w:rPr>
           <w:t>2.2.</w:t>
         </w:r>
@@ -788,7 +829,6 @@
             <w:rFonts w:asciiTheme="minorHAnsi" w:eastAsiaTheme="minorEastAsia" w:hAnsiTheme="minorHAnsi" w:cstheme="minorBidi"/>
             <w:noProof/>
             <w:kern w:val="0"/>
-            <w:sz w:val="22"/>
             <w:szCs w:val="22"/>
             <w:lang w:val="ru-RU" w:eastAsia="ru-RU"/>
           </w:rPr>
@@ -798,6 +838,7 @@
           <w:rPr>
             <w:rStyle w:val="a6"/>
             <w:noProof/>
+            <w:sz w:val="28"/>
           </w:rPr>
           <w:t>Model Mechanism Overview (Atilla)</w:t>
         </w:r>
@@ -805,6 +846,7 @@
           <w:rPr>
             <w:noProof/>
             <w:webHidden/>
+            <w:sz w:val="28"/>
           </w:rPr>
           <w:tab/>
         </w:r>
@@ -812,6 +854,7 @@
           <w:rPr>
             <w:noProof/>
             <w:webHidden/>
+            <w:sz w:val="28"/>
           </w:rPr>
           <w:fldChar w:fldCharType="begin"/>
         </w:r>
@@ -819,19 +862,22 @@
           <w:rPr>
             <w:noProof/>
             <w:webHidden/>
+            <w:sz w:val="28"/>
           </w:rPr>
-          <w:instrText xml:space="preserve"> PAGEREF _Toc172724902 \h </w:instrText>
+          <w:instrText xml:space="preserve"> PAGEREF _Toc172725613 \h </w:instrText>
         </w:r>
         <w:r>
           <w:rPr>
             <w:noProof/>
             <w:webHidden/>
+            <w:sz w:val="28"/>
           </w:rPr>
         </w:r>
         <w:r>
           <w:rPr>
             <w:noProof/>
             <w:webHidden/>
+            <w:sz w:val="28"/>
           </w:rPr>
           <w:fldChar w:fldCharType="separate"/>
         </w:r>
@@ -839,6 +885,7 @@
           <w:rPr>
             <w:noProof/>
             <w:webHidden/>
+            <w:sz w:val="28"/>
           </w:rPr>
           <w:t>6</w:t>
         </w:r>
@@ -846,6 +893,7 @@
           <w:rPr>
             <w:noProof/>
             <w:webHidden/>
+            <w:sz w:val="28"/>
           </w:rPr>
           <w:fldChar w:fldCharType="end"/>
         </w:r>
@@ -861,25 +909,46 @@
           <w:rFonts w:asciiTheme="minorHAnsi" w:eastAsiaTheme="minorEastAsia" w:hAnsiTheme="minorHAnsi" w:cstheme="minorBidi"/>
           <w:noProof/>
           <w:kern w:val="0"/>
-          <w:sz w:val="22"/>
           <w:szCs w:val="22"/>
           <w:lang w:val="ru-RU" w:eastAsia="ru-RU"/>
         </w:rPr>
       </w:pPr>
-      <w:hyperlink w:anchor="_Toc172724903" w:history="1">
+      <w:hyperlink w:anchor="_Toc172725614" w:history="1">
         <w:r>
           <w:rPr>
             <w:rStyle w:val="a6"/>
             <w:rFonts w:cstheme="minorHAnsi"/>
             <w:noProof/>
+            <w:sz w:val="28"/>
             <w:lang w:val="en-US"/>
           </w:rPr>
-          <w:t>Recommended Setup and Conditions</w:t>
+          <w:t xml:space="preserve">Recommended Setup </w:t>
+        </w:r>
+        <w:r>
+          <w:rPr>
+            <w:rStyle w:val="a6"/>
+            <w:rFonts w:cstheme="minorHAnsi"/>
+            <w:noProof/>
+            <w:sz w:val="28"/>
+            <w:lang w:val="en-US"/>
+          </w:rPr>
+          <w:t>a</w:t>
+        </w:r>
+        <w:r>
+          <w:rPr>
+            <w:rStyle w:val="a6"/>
+            <w:rFonts w:cstheme="minorHAnsi"/>
+            <w:noProof/>
+            <w:sz w:val="28"/>
+            <w:lang w:val="en-US"/>
+          </w:rPr>
+          <w:t>nd Conditions</w:t>
         </w:r>
         <w:r>
           <w:rPr>
             <w:noProof/>
             <w:webHidden/>
+            <w:sz w:val="28"/>
           </w:rPr>
           <w:tab/>
         </w:r>
@@ -887,6 +956,7 @@
           <w:rPr>
             <w:noProof/>
             <w:webHidden/>
+            <w:sz w:val="28"/>
           </w:rPr>
           <w:fldChar w:fldCharType="begin"/>
         </w:r>
@@ -894,19 +964,22 @@
           <w:rPr>
             <w:noProof/>
             <w:webHidden/>
+            <w:sz w:val="28"/>
           </w:rPr>
-          <w:instrText xml:space="preserve"> PAGEREF _Toc172724903 \h </w:instrText>
+          <w:instrText xml:space="preserve"> PAGEREF _Toc172725614 \h </w:instrText>
         </w:r>
         <w:r>
           <w:rPr>
             <w:noProof/>
             <w:webHidden/>
+            <w:sz w:val="28"/>
           </w:rPr>
         </w:r>
         <w:r>
           <w:rPr>
             <w:noProof/>
             <w:webHidden/>
+            <w:sz w:val="28"/>
           </w:rPr>
           <w:fldChar w:fldCharType="separate"/>
         </w:r>
@@ -914,6 +987,7 @@
           <w:rPr>
             <w:noProof/>
             <w:webHidden/>
+            <w:sz w:val="28"/>
           </w:rPr>
           <w:t>8</w:t>
         </w:r>
@@ -921,6 +995,7 @@
           <w:rPr>
             <w:noProof/>
             <w:webHidden/>
+            <w:sz w:val="28"/>
           </w:rPr>
           <w:fldChar w:fldCharType="end"/>
         </w:r>
@@ -937,18 +1012,18 @@
           <w:rFonts w:asciiTheme="minorHAnsi" w:eastAsiaTheme="minorEastAsia" w:hAnsiTheme="minorHAnsi" w:cstheme="minorBidi"/>
           <w:noProof/>
           <w:kern w:val="0"/>
-          <w:sz w:val="22"/>
           <w:szCs w:val="22"/>
           <w:lang w:val="ru-RU" w:eastAsia="ru-RU"/>
         </w:rPr>
       </w:pPr>
-      <w:hyperlink w:anchor="_Toc172724904" w:history="1">
+      <w:hyperlink w:anchor="_Toc172725615" w:history="1">
         <w:r>
           <w:rPr>
             <w:rStyle w:val="a6"/>
-            <w:rFonts w:cstheme="minorHAnsi"/>
             <w:i/>
             <w:noProof/>
+            <w:sz w:val="28"/>
+            <w:lang w:val="ru-RU"/>
           </w:rPr>
           <w:t>3.</w:t>
         </w:r>
@@ -957,7 +1032,145 @@
             <w:rFonts w:asciiTheme="minorHAnsi" w:eastAsiaTheme="minorEastAsia" w:hAnsiTheme="minorHAnsi" w:cstheme="minorBidi"/>
             <w:noProof/>
             <w:kern w:val="0"/>
-            <w:sz w:val="22"/>
+            <w:szCs w:val="22"/>
+            <w:lang w:val="ru-RU" w:eastAsia="ru-RU"/>
+          </w:rPr>
+          <w:tab/>
+        </w:r>
+        <w:r>
+          <w:rPr>
+            <w:rStyle w:val="a6"/>
+            <w:noProof/>
+            <w:sz w:val="28"/>
+            <w:lang w:val="en-US"/>
+          </w:rPr>
+          <w:t>Command Sendin</w:t>
+        </w:r>
+        <w:r>
+          <w:rPr>
+            <w:rStyle w:val="a6"/>
+            <w:noProof/>
+            <w:sz w:val="28"/>
+            <w:lang w:val="en-US"/>
+          </w:rPr>
+          <w:t>g</w:t>
+        </w:r>
+        <w:r>
+          <w:rPr>
+            <w:rStyle w:val="a6"/>
+            <w:noProof/>
+            <w:sz w:val="28"/>
+            <w:lang w:val="en-US"/>
+          </w:rPr>
+          <w:t xml:space="preserve"> </w:t>
+        </w:r>
+        <w:r>
+          <w:rPr>
+            <w:rStyle w:val="a6"/>
+            <w:noProof/>
+            <w:sz w:val="28"/>
+            <w:lang w:val="en-US"/>
+          </w:rPr>
+          <w:t xml:space="preserve">Logic </w:t>
+        </w:r>
+        <w:r>
+          <w:rPr>
+            <w:rStyle w:val="a6"/>
+            <w:i/>
+            <w:noProof/>
+            <w:sz w:val="28"/>
+            <w:lang w:val="en-US"/>
+          </w:rPr>
+          <w:t>(By Matsvei)</w:t>
+        </w:r>
+        <w:r>
+          <w:rPr>
+            <w:noProof/>
+            <w:webHidden/>
+            <w:sz w:val="28"/>
+          </w:rPr>
+          <w:tab/>
+        </w:r>
+        <w:r>
+          <w:rPr>
+            <w:noProof/>
+            <w:webHidden/>
+            <w:sz w:val="28"/>
+          </w:rPr>
+          <w:fldChar w:fldCharType="begin"/>
+        </w:r>
+        <w:r>
+          <w:rPr>
+            <w:noProof/>
+            <w:webHidden/>
+            <w:sz w:val="28"/>
+          </w:rPr>
+          <w:instrText xml:space="preserve"> PAGEREF _Toc172725615 \h </w:instrText>
+        </w:r>
+        <w:r>
+          <w:rPr>
+            <w:noProof/>
+            <w:webHidden/>
+            <w:sz w:val="28"/>
+          </w:rPr>
+        </w:r>
+        <w:r>
+          <w:rPr>
+            <w:noProof/>
+            <w:webHidden/>
+            <w:sz w:val="28"/>
+          </w:rPr>
+          <w:fldChar w:fldCharType="separate"/>
+        </w:r>
+        <w:r>
+          <w:rPr>
+            <w:noProof/>
+            <w:webHidden/>
+            <w:sz w:val="28"/>
+          </w:rPr>
+          <w:t>9</w:t>
+        </w:r>
+        <w:r>
+          <w:rPr>
+            <w:noProof/>
+            <w:webHidden/>
+            <w:sz w:val="28"/>
+          </w:rPr>
+          <w:fldChar w:fldCharType="end"/>
+        </w:r>
+      </w:hyperlink>
+    </w:p>
+    <w:p>
+      <w:pPr>
+        <w:pStyle w:val="10"/>
+        <w:tabs>
+          <w:tab w:val="left" w:pos="576"/>
+          <w:tab w:val="right" w:leader="dot" w:pos="9350"/>
+        </w:tabs>
+        <w:rPr>
+          <w:rFonts w:asciiTheme="minorHAnsi" w:eastAsiaTheme="minorEastAsia" w:hAnsiTheme="minorHAnsi" w:cstheme="minorBidi"/>
+          <w:noProof/>
+          <w:kern w:val="0"/>
+          <w:szCs w:val="22"/>
+          <w:lang w:val="ru-RU" w:eastAsia="ru-RU"/>
+        </w:rPr>
+      </w:pPr>
+      <w:hyperlink w:anchor="_Toc172725616" w:history="1">
+        <w:r>
+          <w:rPr>
+            <w:rStyle w:val="a6"/>
+            <w:rFonts w:cstheme="minorHAnsi"/>
+            <w:i/>
+            <w:noProof/>
+            <w:sz w:val="28"/>
+          </w:rPr>
+          <w:t>4.</w:t>
+        </w:r>
+        <w:r>
+          <w:rPr>
+            <w:rFonts w:asciiTheme="minorHAnsi" w:eastAsiaTheme="minorEastAsia" w:hAnsiTheme="minorHAnsi" w:cstheme="minorBidi"/>
+            <w:noProof/>
+            <w:kern w:val="0"/>
             <w:szCs w:val="22"/>
             <w:lang w:val="ru-RU" w:eastAsia="ru-RU"/>
           </w:rPr>
@@ -968,8 +1181,27 @@
             <w:rStyle w:val="a6"/>
             <w:rFonts w:cstheme="minorHAnsi"/>
             <w:noProof/>
+            <w:sz w:val="28"/>
           </w:rPr>
-          <w:t xml:space="preserve">HTTP Server </w:t>
+          <w:t>HTTP Ser</w:t>
+        </w:r>
+        <w:r>
+          <w:rPr>
+            <w:rStyle w:val="a6"/>
+            <w:rFonts w:cstheme="minorHAnsi"/>
+            <w:noProof/>
+            <w:sz w:val="28"/>
+          </w:rPr>
+          <w:t>v</w:t>
+        </w:r>
+        <w:r>
+          <w:rPr>
+            <w:rStyle w:val="a6"/>
+            <w:rFonts w:cstheme="minorHAnsi"/>
+            <w:noProof/>
+            <w:sz w:val="28"/>
+          </w:rPr>
+          <w:t xml:space="preserve">er </w:t>
         </w:r>
         <w:r>
           <w:rPr>
@@ -977,6 +1209,7 @@
             <w:rFonts w:cstheme="minorHAnsi"/>
             <w:i/>
             <w:noProof/>
+            <w:sz w:val="28"/>
           </w:rPr>
           <w:t>(By Kirill)</w:t>
         </w:r>
@@ -984,6 +1217,7 @@
           <w:rPr>
             <w:noProof/>
             <w:webHidden/>
+            <w:sz w:val="28"/>
           </w:rPr>
           <w:tab/>
         </w:r>
@@ -991,6 +1225,7 @@
           <w:rPr>
             <w:noProof/>
             <w:webHidden/>
+            <w:sz w:val="28"/>
           </w:rPr>
           <w:fldChar w:fldCharType="begin"/>
         </w:r>
@@ -998,19 +1233,22 @@
           <w:rPr>
             <w:noProof/>
             <w:webHidden/>
+            <w:sz w:val="28"/>
           </w:rPr>
-          <w:instrText xml:space="preserve"> PAGEREF _Toc172724904 \h </w:instrText>
+          <w:instrText xml:space="preserve"> PAGEREF _Toc172725616 \h </w:instrText>
         </w:r>
         <w:r>
           <w:rPr>
             <w:noProof/>
             <w:webHidden/>
+            <w:sz w:val="28"/>
           </w:rPr>
         </w:r>
         <w:r>
           <w:rPr>
             <w:noProof/>
             <w:webHidden/>
+            <w:sz w:val="28"/>
           </w:rPr>
           <w:fldChar w:fldCharType="separate"/>
         </w:r>
@@ -1018,13 +1256,15 @@
           <w:rPr>
             <w:noProof/>
             <w:webHidden/>
+            <w:sz w:val="28"/>
           </w:rPr>
-          <w:t>8</w:t>
+          <w:t>12</w:t>
         </w:r>
         <w:r>
           <w:rPr>
             <w:noProof/>
             <w:webHidden/>
+            <w:sz w:val="28"/>
           </w:rPr>
           <w:fldChar w:fldCharType="end"/>
         </w:r>
@@ -1041,26 +1281,25 @@
           <w:rFonts w:asciiTheme="minorHAnsi" w:eastAsiaTheme="minorEastAsia" w:hAnsiTheme="minorHAnsi" w:cstheme="minorBidi"/>
           <w:noProof/>
           <w:kern w:val="0"/>
-          <w:sz w:val="22"/>
           <w:szCs w:val="22"/>
           <w:lang w:val="ru-RU" w:eastAsia="ru-RU"/>
         </w:rPr>
       </w:pPr>
-      <w:hyperlink w:anchor="_Toc172724905" w:history="1">
+      <w:hyperlink w:anchor="_Toc172725617" w:history="1">
         <w:r>
           <w:rPr>
             <w:rStyle w:val="a6"/>
             <w:noProof/>
+            <w:sz w:val="28"/>
             <w:lang w:val="en-US"/>
           </w:rPr>
-          <w:t>3.1.</w:t>
+          <w:t>4.1.</w:t>
         </w:r>
         <w:r>
           <w:rPr>
             <w:rFonts w:asciiTheme="minorHAnsi" w:eastAsiaTheme="minorEastAsia" w:hAnsiTheme="minorHAnsi" w:cstheme="minorBidi"/>
             <w:noProof/>
             <w:kern w:val="0"/>
-            <w:sz w:val="22"/>
             <w:szCs w:val="22"/>
             <w:lang w:val="ru-RU" w:eastAsia="ru-RU"/>
           </w:rPr>
@@ -1070,6 +1309,7 @@
           <w:rPr>
             <w:rStyle w:val="a6"/>
             <w:noProof/>
+            <w:sz w:val="28"/>
             <w:lang w:val="en-US"/>
           </w:rPr>
           <w:t>Technologies and reasoning.</w:t>
@@ -1078,6 +1318,7 @@
           <w:rPr>
             <w:noProof/>
             <w:webHidden/>
+            <w:sz w:val="28"/>
           </w:rPr>
           <w:tab/>
         </w:r>
@@ -1085,6 +1326,7 @@
           <w:rPr>
             <w:noProof/>
             <w:webHidden/>
+            <w:sz w:val="28"/>
           </w:rPr>
           <w:fldChar w:fldCharType="begin"/>
         </w:r>
@@ -1092,19 +1334,22 @@
           <w:rPr>
             <w:noProof/>
             <w:webHidden/>
+            <w:sz w:val="28"/>
           </w:rPr>
-          <w:instrText xml:space="preserve"> PAGEREF _Toc172724905 \h </w:instrText>
+          <w:instrText xml:space="preserve"> PAGEREF _Toc172725617 \h </w:instrText>
         </w:r>
         <w:r>
           <w:rPr>
             <w:noProof/>
             <w:webHidden/>
+            <w:sz w:val="28"/>
           </w:rPr>
         </w:r>
         <w:r>
           <w:rPr>
             <w:noProof/>
             <w:webHidden/>
+            <w:sz w:val="28"/>
           </w:rPr>
           <w:fldChar w:fldCharType="separate"/>
         </w:r>
@@ -1112,13 +1357,15 @@
           <w:rPr>
             <w:noProof/>
             <w:webHidden/>
+            <w:sz w:val="28"/>
           </w:rPr>
-          <w:t>8</w:t>
+          <w:t>13</w:t>
         </w:r>
         <w:r>
           <w:rPr>
             <w:noProof/>
             <w:webHidden/>
+            <w:sz w:val="28"/>
           </w:rPr>
           <w:fldChar w:fldCharType="end"/>
         </w:r>
@@ -1135,26 +1382,25 @@
           <w:rFonts w:asciiTheme="minorHAnsi" w:eastAsiaTheme="minorEastAsia" w:hAnsiTheme="minorHAnsi" w:cstheme="minorBidi"/>
           <w:noProof/>
           <w:kern w:val="0"/>
-          <w:sz w:val="22"/>
           <w:szCs w:val="22"/>
           <w:lang w:val="ru-RU" w:eastAsia="ru-RU"/>
         </w:rPr>
       </w:pPr>
-      <w:hyperlink w:anchor="_Toc172724906" w:history="1">
+      <w:hyperlink w:anchor="_Toc172725618" w:history="1">
         <w:r>
           <w:rPr>
             <w:rStyle w:val="a6"/>
             <w:noProof/>
+            <w:sz w:val="28"/>
             <w:lang w:val="en-US"/>
           </w:rPr>
-          <w:t>3.2.</w:t>
+          <w:t>4.2.</w:t>
         </w:r>
         <w:r>
           <w:rPr>
             <w:rFonts w:asciiTheme="minorHAnsi" w:eastAsiaTheme="minorEastAsia" w:hAnsiTheme="minorHAnsi" w:cstheme="minorBidi"/>
             <w:noProof/>
             <w:kern w:val="0"/>
-            <w:sz w:val="22"/>
             <w:szCs w:val="22"/>
             <w:lang w:val="ru-RU" w:eastAsia="ru-RU"/>
           </w:rPr>
@@ -1164,6 +1410,7 @@
           <w:rPr>
             <w:rStyle w:val="a6"/>
             <w:noProof/>
+            <w:sz w:val="28"/>
             <w:lang w:val="en-US"/>
           </w:rPr>
           <w:t>Server Architecture</w:t>
@@ -1172,6 +1419,7 @@
           <w:rPr>
             <w:noProof/>
             <w:webHidden/>
+            <w:sz w:val="28"/>
           </w:rPr>
           <w:tab/>
         </w:r>
@@ -1179,6 +1427,7 @@
           <w:rPr>
             <w:noProof/>
             <w:webHidden/>
+            <w:sz w:val="28"/>
           </w:rPr>
           <w:fldChar w:fldCharType="begin"/>
         </w:r>
@@ -1186,19 +1435,22 @@
           <w:rPr>
             <w:noProof/>
             <w:webHidden/>
+            <w:sz w:val="28"/>
           </w:rPr>
-          <w:instrText xml:space="preserve"> PAGEREF _Toc172724906 \h </w:instrText>
+          <w:instrText xml:space="preserve"> PAGEREF _Toc172725618 \h </w:instrText>
         </w:r>
         <w:r>
           <w:rPr>
             <w:noProof/>
             <w:webHidden/>
+            <w:sz w:val="28"/>
           </w:rPr>
         </w:r>
         <w:r>
           <w:rPr>
             <w:noProof/>
             <w:webHidden/>
+            <w:sz w:val="28"/>
           </w:rPr>
           <w:fldChar w:fldCharType="separate"/>
         </w:r>
@@ -1206,13 +1458,15 @@
           <w:rPr>
             <w:noProof/>
             <w:webHidden/>
+            <w:sz w:val="28"/>
           </w:rPr>
-          <w:t>9</w:t>
+          <w:t>13</w:t>
         </w:r>
         <w:r>
           <w:rPr>
             <w:noProof/>
             <w:webHidden/>
+            <w:sz w:val="28"/>
           </w:rPr>
           <w:fldChar w:fldCharType="end"/>
         </w:r>
@@ -1229,25 +1483,24 @@
           <w:rFonts w:asciiTheme="minorHAnsi" w:eastAsiaTheme="minorEastAsia" w:hAnsiTheme="minorHAnsi" w:cstheme="minorBidi"/>
           <w:noProof/>
           <w:kern w:val="0"/>
-          <w:sz w:val="22"/>
           <w:szCs w:val="22"/>
           <w:lang w:val="ru-RU" w:eastAsia="ru-RU"/>
         </w:rPr>
       </w:pPr>
-      <w:hyperlink w:anchor="_Toc172724907" w:history="1">
+      <w:hyperlink w:anchor="_Toc172725619" w:history="1">
         <w:r>
           <w:rPr>
             <w:rStyle w:val="a6"/>
             <w:noProof/>
+            <w:sz w:val="28"/>
           </w:rPr>
-          <w:t>3.2.1.</w:t>
+          <w:t>4.2.1.</w:t>
         </w:r>
         <w:r>
           <w:rPr>
             <w:rFonts w:asciiTheme="minorHAnsi" w:eastAsiaTheme="minorEastAsia" w:hAnsiTheme="minorHAnsi" w:cstheme="minorBidi"/>
             <w:noProof/>
             <w:kern w:val="0"/>
-            <w:sz w:val="22"/>
             <w:szCs w:val="22"/>
             <w:lang w:val="ru-RU" w:eastAsia="ru-RU"/>
           </w:rPr>
@@ -1257,6 +1510,7 @@
           <w:rPr>
             <w:rStyle w:val="a6"/>
             <w:noProof/>
+            <w:sz w:val="28"/>
           </w:rPr>
           <w:t>Controllers</w:t>
         </w:r>
@@ -1264,6 +1518,7 @@
           <w:rPr>
             <w:noProof/>
             <w:webHidden/>
+            <w:sz w:val="28"/>
           </w:rPr>
           <w:tab/>
         </w:r>
@@ -1271,6 +1526,7 @@
           <w:rPr>
             <w:noProof/>
             <w:webHidden/>
+            <w:sz w:val="28"/>
           </w:rPr>
           <w:fldChar w:fldCharType="begin"/>
         </w:r>
@@ -1278,19 +1534,22 @@
           <w:rPr>
             <w:noProof/>
             <w:webHidden/>
+            <w:sz w:val="28"/>
           </w:rPr>
-          <w:instrText xml:space="preserve"> PAGEREF _Toc172724907 \h </w:instrText>
+          <w:instrText xml:space="preserve"> PAGEREF _Toc172725619 \h </w:instrText>
         </w:r>
         <w:r>
           <w:rPr>
             <w:noProof/>
             <w:webHidden/>
+            <w:sz w:val="28"/>
           </w:rPr>
         </w:r>
         <w:r>
           <w:rPr>
             <w:noProof/>
             <w:webHidden/>
+            <w:sz w:val="28"/>
           </w:rPr>
           <w:fldChar w:fldCharType="separate"/>
         </w:r>
@@ -1298,13 +1557,15 @@
           <w:rPr>
             <w:noProof/>
             <w:webHidden/>
+            <w:sz w:val="28"/>
           </w:rPr>
-          <w:t>10</w:t>
+          <w:t>14</w:t>
         </w:r>
         <w:r>
           <w:rPr>
             <w:noProof/>
             <w:webHidden/>
+            <w:sz w:val="28"/>
           </w:rPr>
           <w:fldChar w:fldCharType="end"/>
         </w:r>
@@ -1321,26 +1582,25 @@
           <w:rFonts w:asciiTheme="minorHAnsi" w:eastAsiaTheme="minorEastAsia" w:hAnsiTheme="minorHAnsi" w:cstheme="minorBidi"/>
           <w:noProof/>
           <w:kern w:val="0"/>
-          <w:sz w:val="22"/>
           <w:szCs w:val="22"/>
           <w:lang w:val="ru-RU" w:eastAsia="ru-RU"/>
         </w:rPr>
       </w:pPr>
-      <w:hyperlink w:anchor="_Toc172724908" w:history="1">
+      <w:hyperlink w:anchor="_Toc172725620" w:history="1">
         <w:r>
           <w:rPr>
             <w:rStyle w:val="a6"/>
             <w:noProof/>
+            <w:sz w:val="28"/>
             <w:lang w:val="en-US"/>
           </w:rPr>
-          <w:t>3.2.2.</w:t>
+          <w:t>4.2.2.</w:t>
         </w:r>
         <w:r>
           <w:rPr>
             <w:rFonts w:asciiTheme="minorHAnsi" w:eastAsiaTheme="minorEastAsia" w:hAnsiTheme="minorHAnsi" w:cstheme="minorBidi"/>
             <w:noProof/>
             <w:kern w:val="0"/>
-            <w:sz w:val="22"/>
             <w:szCs w:val="22"/>
             <w:lang w:val="ru-RU" w:eastAsia="ru-RU"/>
           </w:rPr>
@@ -1350,6 +1610,7 @@
           <w:rPr>
             <w:rStyle w:val="a6"/>
             <w:noProof/>
+            <w:sz w:val="28"/>
             <w:lang w:val="en-US"/>
           </w:rPr>
           <w:t>Services</w:t>
@@ -1358,6 +1619,7 @@
           <w:rPr>
             <w:noProof/>
             <w:webHidden/>
+            <w:sz w:val="28"/>
           </w:rPr>
           <w:tab/>
         </w:r>
@@ -1365,6 +1627,7 @@
           <w:rPr>
             <w:noProof/>
             <w:webHidden/>
+            <w:sz w:val="28"/>
           </w:rPr>
           <w:fldChar w:fldCharType="begin"/>
         </w:r>
@@ -1372,19 +1635,22 @@
           <w:rPr>
             <w:noProof/>
             <w:webHidden/>
+            <w:sz w:val="28"/>
           </w:rPr>
-          <w:instrText xml:space="preserve"> PAGEREF _Toc172724908 \h </w:instrText>
+          <w:instrText xml:space="preserve"> PAGEREF _Toc172725620 \h </w:instrText>
         </w:r>
         <w:r>
           <w:rPr>
             <w:noProof/>
             <w:webHidden/>
+            <w:sz w:val="28"/>
           </w:rPr>
         </w:r>
         <w:r>
           <w:rPr>
             <w:noProof/>
             <w:webHidden/>
+            <w:sz w:val="28"/>
           </w:rPr>
           <w:fldChar w:fldCharType="separate"/>
         </w:r>
@@ -1392,13 +1658,15 @@
           <w:rPr>
             <w:noProof/>
             <w:webHidden/>
+            <w:sz w:val="28"/>
           </w:rPr>
-          <w:t>14</w:t>
+          <w:t>18</w:t>
         </w:r>
         <w:r>
           <w:rPr>
             <w:noProof/>
             <w:webHidden/>
+            <w:sz w:val="28"/>
           </w:rPr>
           <w:fldChar w:fldCharType="end"/>
         </w:r>
@@ -1415,26 +1683,25 @@
           <w:rFonts w:asciiTheme="minorHAnsi" w:eastAsiaTheme="minorEastAsia" w:hAnsiTheme="minorHAnsi" w:cstheme="minorBidi"/>
           <w:noProof/>
           <w:kern w:val="0"/>
-          <w:sz w:val="22"/>
           <w:szCs w:val="22"/>
           <w:lang w:val="ru-RU" w:eastAsia="ru-RU"/>
         </w:rPr>
       </w:pPr>
-      <w:hyperlink w:anchor="_Toc172724909" w:history="1">
+      <w:hyperlink w:anchor="_Toc172725621" w:history="1">
         <w:r>
           <w:rPr>
             <w:rStyle w:val="a6"/>
             <w:noProof/>
+            <w:sz w:val="28"/>
             <w:lang w:val="en-US"/>
           </w:rPr>
-          <w:t>3.2.3.</w:t>
+          <w:t>4.2.3.</w:t>
         </w:r>
         <w:r>
           <w:rPr>
             <w:rFonts w:asciiTheme="minorHAnsi" w:eastAsiaTheme="minorEastAsia" w:hAnsiTheme="minorHAnsi" w:cstheme="minorBidi"/>
             <w:noProof/>
             <w:kern w:val="0"/>
-            <w:sz w:val="22"/>
             <w:szCs w:val="22"/>
             <w:lang w:val="ru-RU" w:eastAsia="ru-RU"/>
           </w:rPr>
@@ -1444,6 +1711,7 @@
           <w:rPr>
             <w:rStyle w:val="a6"/>
             <w:noProof/>
+            <w:sz w:val="28"/>
             <w:lang w:val="en-US"/>
           </w:rPr>
           <w:t>How the Server Handles Camera Commands</w:t>
@@ -1452,6 +1720,7 @@
           <w:rPr>
             <w:noProof/>
             <w:webHidden/>
+            <w:sz w:val="28"/>
           </w:rPr>
           <w:tab/>
         </w:r>
@@ -1459,6 +1728,7 @@
           <w:rPr>
             <w:noProof/>
             <w:webHidden/>
+            <w:sz w:val="28"/>
           </w:rPr>
           <w:fldChar w:fldCharType="begin"/>
         </w:r>
@@ -1466,19 +1736,22 @@
           <w:rPr>
             <w:noProof/>
             <w:webHidden/>
+            <w:sz w:val="28"/>
           </w:rPr>
-          <w:instrText xml:space="preserve"> PAGEREF _Toc172724909 \h </w:instrText>
+          <w:instrText xml:space="preserve"> PAGEREF _Toc172725621 \h </w:instrText>
         </w:r>
         <w:r>
           <w:rPr>
             <w:noProof/>
             <w:webHidden/>
+            <w:sz w:val="28"/>
           </w:rPr>
         </w:r>
         <w:r>
           <w:rPr>
             <w:noProof/>
             <w:webHidden/>
+            <w:sz w:val="28"/>
           </w:rPr>
           <w:fldChar w:fldCharType="separate"/>
         </w:r>
@@ -1486,13 +1759,15 @@
           <w:rPr>
             <w:noProof/>
             <w:webHidden/>
+            <w:sz w:val="28"/>
           </w:rPr>
-          <w:t>23</w:t>
+          <w:t>27</w:t>
         </w:r>
         <w:r>
           <w:rPr>
             <w:noProof/>
             <w:webHidden/>
+            <w:sz w:val="28"/>
           </w:rPr>
           <w:fldChar w:fldCharType="end"/>
         </w:r>
@@ -1500,19 +1775,23 @@
     </w:p>
     <w:p>
       <w:r>
+        <w:rPr>
+          <w:sz w:val="28"/>
+        </w:rPr>
         <w:fldChar w:fldCharType="end"/>
       </w:r>
-    </w:p>
-    <w:p>
-      <w:pPr>
-        <w:rPr>
-          <w:lang w:val="en-GB"/>
+      <w:bookmarkEnd w:id="0"/>
+    </w:p>
+    <w:p>
+      <w:pPr>
+        <w:rPr>
+          <w:lang w:val="en-US"/>
         </w:rPr>
       </w:pPr>
       <w:r>
         <w:br w:type="page"/>
       </w:r>
-      <w:bookmarkStart w:id="0" w:name="_Toc138082111"/>
+      <w:bookmarkStart w:id="1" w:name="_Toc138082111"/>
     </w:p>
     <w:p>
       <w:pPr>
@@ -1524,7 +1803,7 @@
         </w:sectPr>
       </w:pPr>
     </w:p>
-    <w:bookmarkEnd w:id="0"/>
+    <w:bookmarkEnd w:id="1"/>
     <w:p>
       <w:pPr>
         <w:pStyle w:val="1"/>
@@ -1537,7 +1816,7 @@
         <w:lastRenderedPageBreak/>
         <w:t xml:space="preserve"> </w:t>
       </w:r>
-      <w:bookmarkStart w:id="1" w:name="_Toc172724896"/>
+      <w:bookmarkStart w:id="2" w:name="_Toc172725607"/>
       <w:r>
         <w:t xml:space="preserve">Motivation </w:t>
       </w:r>
@@ -1561,7 +1840,7 @@
       <w:r>
         <w:t>setting</w:t>
       </w:r>
-      <w:bookmarkEnd w:id="1"/>
+      <w:bookmarkEnd w:id="2"/>
       <w:proofErr w:type="spellEnd"/>
     </w:p>
     <w:p/>
@@ -1627,7 +1906,7 @@
         <w:lastRenderedPageBreak/>
         <w:t xml:space="preserve"> </w:t>
       </w:r>
-      <w:bookmarkStart w:id="2" w:name="_Toc172724897"/>
+      <w:bookmarkStart w:id="3" w:name="_Toc172725608"/>
       <w:r>
         <w:rPr>
           <w:lang w:val="en-US"/>
@@ -1673,7 +1952,7 @@
         </w:rPr>
         <w:t>)</w:t>
       </w:r>
-      <w:bookmarkEnd w:id="2"/>
+      <w:bookmarkEnd w:id="3"/>
     </w:p>
     <w:p>
       <w:pPr>
@@ -1683,7 +1962,7 @@
           <w:numId w:val="5"/>
         </w:numPr>
       </w:pPr>
-      <w:bookmarkStart w:id="3" w:name="_Toc172724898"/>
+      <w:bookmarkStart w:id="4" w:name="_Toc172725609"/>
       <w:r>
         <w:t xml:space="preserve">Evaluation </w:t>
       </w:r>
@@ -1703,7 +1982,7 @@
       <w:r>
         <w:t xml:space="preserve"> Models</w:t>
       </w:r>
-      <w:bookmarkEnd w:id="3"/>
+      <w:bookmarkEnd w:id="4"/>
     </w:p>
     <w:p>
       <w:pPr>
@@ -1754,9 +2033,9 @@
           <w:lang w:val="en-US"/>
         </w:rPr>
       </w:pPr>
-      <w:bookmarkStart w:id="4" w:name="_cokv1kg7c07" w:colFirst="0" w:colLast="0"/>
-      <w:bookmarkStart w:id="5" w:name="_Toc172724899"/>
-      <w:bookmarkEnd w:id="4"/>
+      <w:bookmarkStart w:id="5" w:name="_cokv1kg7c07" w:colFirst="0" w:colLast="0"/>
+      <w:bookmarkStart w:id="6" w:name="_Toc172725610"/>
+      <w:bookmarkEnd w:id="5"/>
       <w:proofErr w:type="spellStart"/>
       <w:r>
         <w:rPr>
@@ -1799,7 +2078,7 @@
         </w:rPr>
         <w:t>)</w:t>
       </w:r>
-      <w:bookmarkEnd w:id="5"/>
+      <w:bookmarkEnd w:id="6"/>
     </w:p>
     <w:p>
       <w:pPr>
@@ -2049,9 +2328,9 @@
           <w:lang w:val="en-US"/>
         </w:rPr>
       </w:pPr>
-      <w:bookmarkStart w:id="6" w:name="_lumthmaik3ce" w:colFirst="0" w:colLast="0"/>
-      <w:bookmarkStart w:id="7" w:name="_Toc172724900"/>
-      <w:bookmarkEnd w:id="6"/>
+      <w:bookmarkStart w:id="7" w:name="_lumthmaik3ce" w:colFirst="0" w:colLast="0"/>
+      <w:bookmarkStart w:id="8" w:name="_Toc172725611"/>
+      <w:bookmarkEnd w:id="7"/>
       <w:r>
         <w:rPr>
           <w:lang w:val="en-US"/>
@@ -2086,7 +2365,7 @@
         </w:rPr>
         <w:t>)</w:t>
       </w:r>
-      <w:bookmarkEnd w:id="7"/>
+      <w:bookmarkEnd w:id="8"/>
     </w:p>
     <w:p>
       <w:pPr>
@@ -2511,9 +2790,9 @@
           <w:lang w:val="en-US"/>
         </w:rPr>
       </w:pPr>
-      <w:bookmarkStart w:id="8" w:name="_88vr2vqlip7v" w:colFirst="0" w:colLast="0"/>
-      <w:bookmarkStart w:id="9" w:name="_Toc172724901"/>
-      <w:bookmarkEnd w:id="8"/>
+      <w:bookmarkStart w:id="9" w:name="_88vr2vqlip7v" w:colFirst="0" w:colLast="0"/>
+      <w:bookmarkStart w:id="10" w:name="_Toc172725612"/>
+      <w:bookmarkEnd w:id="9"/>
       <w:r>
         <w:rPr>
           <w:lang w:val="en-US"/>
@@ -2548,7 +2827,7 @@
         </w:rPr>
         <w:t>)</w:t>
       </w:r>
-      <w:bookmarkEnd w:id="9"/>
+      <w:bookmarkEnd w:id="10"/>
     </w:p>
     <w:p>
       <w:pPr>
@@ -2731,16 +3010,7 @@
           <w:rFonts w:asciiTheme="minorHAnsi" w:hAnsiTheme="minorHAnsi" w:cstheme="minorHAnsi"/>
           <w:lang w:val="en-US"/>
         </w:rPr>
-        <w:t>trains the model based on input data (42 numbers - coordinates of 21 key points (X and Y of each</w:t>
-      </w:r>
-      <w:bookmarkStart w:id="10" w:name="_GoBack"/>
-      <w:bookmarkEnd w:id="10"/>
-      <w:r>
-        <w:rPr>
-          <w:rFonts w:asciiTheme="minorHAnsi" w:hAnsiTheme="minorHAnsi" w:cstheme="minorHAnsi"/>
-          <w:lang w:val="en-US"/>
-        </w:rPr>
-        <w:t xml:space="preserve"> key point)). Key points are indicated below in the picture. </w:t>
+        <w:t xml:space="preserve">trains the model based on input data (42 numbers - coordinates of 21 key points (X and Y of each key point)). Key points are indicated below in the picture. </w:t>
       </w:r>
     </w:p>
     <w:p>
@@ -3733,7 +4003,7 @@
         </w:numPr>
       </w:pPr>
       <w:bookmarkStart w:id="12" w:name="_l6kh7lswbfqy" w:colFirst="0" w:colLast="0"/>
-      <w:bookmarkStart w:id="13" w:name="_Toc172724902"/>
+      <w:bookmarkStart w:id="13" w:name="_Toc172725613"/>
       <w:bookmarkEnd w:id="12"/>
       <w:r>
         <w:drawing>
@@ -6009,7 +6279,7 @@
         </w:rPr>
       </w:pPr>
       <w:bookmarkStart w:id="20" w:name="_loebmc2yousa" w:colFirst="0" w:colLast="0"/>
-      <w:bookmarkStart w:id="21" w:name="_Toc172724903"/>
+      <w:bookmarkStart w:id="21" w:name="_Toc172725614"/>
       <w:bookmarkEnd w:id="20"/>
       <w:r>
         <w:rPr>
@@ -6160,7 +6430,7 @@
         <w:spacing w:before="240" w:after="240"/>
         <w:rPr>
           <w:rFonts w:asciiTheme="minorHAnsi" w:hAnsiTheme="minorHAnsi" w:cstheme="minorHAnsi"/>
-          <w:lang w:val="en-US"/>
+          <w:lang w:val="ru-RU"/>
         </w:rPr>
       </w:pPr>
       <w:r>
@@ -6173,16 +6443,100 @@
     </w:p>
     <w:p>
       <w:pPr>
-        <w:rPr>
-          <w:lang w:val="en-US"/>
-        </w:rPr>
-      </w:pPr>
-    </w:p>
-    <w:p>
-      <w:pPr>
-        <w:pStyle w:val="1"/>
-        <w:rPr>
-          <w:lang w:val="en-US"/>
+        <w:spacing w:before="240" w:after="240"/>
+        <w:rPr>
+          <w:rFonts w:asciiTheme="minorHAnsi" w:hAnsiTheme="minorHAnsi" w:cstheme="minorHAnsi"/>
+          <w:lang w:val="ru-RU"/>
+        </w:rPr>
+      </w:pPr>
+    </w:p>
+    <w:p>
+      <w:pPr>
+        <w:spacing w:before="240" w:after="240"/>
+        <w:rPr>
+          <w:rFonts w:asciiTheme="minorHAnsi" w:hAnsiTheme="minorHAnsi" w:cstheme="minorHAnsi"/>
+          <w:lang w:val="ru-RU"/>
+        </w:rPr>
+      </w:pPr>
+    </w:p>
+    <w:p>
+      <w:pPr>
+        <w:spacing w:before="240" w:after="240"/>
+        <w:rPr>
+          <w:rFonts w:asciiTheme="minorHAnsi" w:hAnsiTheme="minorHAnsi" w:cstheme="minorHAnsi"/>
+          <w:lang w:val="ru-RU"/>
+        </w:rPr>
+      </w:pPr>
+    </w:p>
+    <w:p>
+      <w:pPr>
+        <w:spacing w:before="240" w:after="240"/>
+        <w:rPr>
+          <w:rFonts w:asciiTheme="minorHAnsi" w:hAnsiTheme="minorHAnsi" w:cstheme="minorHAnsi"/>
+          <w:lang w:val="ru-RU"/>
+        </w:rPr>
+      </w:pPr>
+    </w:p>
+    <w:p>
+      <w:pPr>
+        <w:spacing w:before="240" w:after="240"/>
+        <w:rPr>
+          <w:rFonts w:asciiTheme="minorHAnsi" w:hAnsiTheme="minorHAnsi" w:cstheme="minorHAnsi"/>
+          <w:lang w:val="ru-RU"/>
+        </w:rPr>
+      </w:pPr>
+    </w:p>
+    <w:p>
+      <w:pPr>
+        <w:spacing w:before="240" w:after="240"/>
+        <w:rPr>
+          <w:rFonts w:asciiTheme="minorHAnsi" w:hAnsiTheme="minorHAnsi" w:cstheme="minorHAnsi"/>
+          <w:lang w:val="ru-RU"/>
+        </w:rPr>
+      </w:pPr>
+    </w:p>
+    <w:p>
+      <w:pPr>
+        <w:spacing w:before="240" w:after="240"/>
+        <w:rPr>
+          <w:rFonts w:asciiTheme="minorHAnsi" w:hAnsiTheme="minorHAnsi" w:cstheme="minorHAnsi"/>
+          <w:lang w:val="ru-RU"/>
+        </w:rPr>
+      </w:pPr>
+    </w:p>
+    <w:p>
+      <w:pPr>
+        <w:spacing w:before="240" w:after="240"/>
+        <w:rPr>
+          <w:rFonts w:asciiTheme="minorHAnsi" w:hAnsiTheme="minorHAnsi" w:cstheme="minorHAnsi"/>
+          <w:lang w:val="ru-RU"/>
+        </w:rPr>
+      </w:pPr>
+    </w:p>
+    <w:p>
+      <w:pPr>
+        <w:spacing w:before="240" w:after="240"/>
+        <w:rPr>
+          <w:rFonts w:asciiTheme="minorHAnsi" w:hAnsiTheme="minorHAnsi" w:cstheme="minorHAnsi"/>
+          <w:lang w:val="ru-RU"/>
+        </w:rPr>
+      </w:pPr>
+    </w:p>
+    <w:p>
+      <w:pPr>
+        <w:spacing w:before="240" w:after="240"/>
+        <w:rPr>
+          <w:rFonts w:asciiTheme="minorHAnsi" w:hAnsiTheme="minorHAnsi" w:cstheme="minorHAnsi"/>
+          <w:lang w:val="ru-RU"/>
+        </w:rPr>
+      </w:pPr>
+    </w:p>
+    <w:p>
+      <w:pPr>
+        <w:spacing w:before="240" w:after="240"/>
+        <w:rPr>
+          <w:rFonts w:asciiTheme="minorHAnsi" w:hAnsiTheme="minorHAnsi" w:cstheme="minorHAnsi"/>
+          <w:lang w:val="ru-RU"/>
         </w:rPr>
       </w:pPr>
     </w:p>
@@ -6194,33 +6548,1363 @@
           <w:numId w:val="5"/>
         </w:numPr>
         <w:rPr>
-          <w:rFonts w:asciiTheme="minorHAnsi" w:hAnsiTheme="minorHAnsi" w:cstheme="minorHAnsi"/>
           <w:i/>
-        </w:rPr>
-      </w:pPr>
-      <w:r>
-        <w:rPr>
+          <w:lang w:val="ru-RU"/>
+        </w:rPr>
+      </w:pPr>
+      <w:bookmarkStart w:id="22" w:name="_Toc172725615"/>
+      <w:r>
+        <w:rPr>
+          <w:lang w:val="en-US"/>
+        </w:rPr>
+        <w:lastRenderedPageBreak/>
+        <w:t>Command Sending Logic</w:t>
+      </w:r>
+      <w:r>
+        <w:rPr>
+          <w:sz w:val="44"/>
           <w:lang w:val="en-US"/>
         </w:rPr>
         <w:t xml:space="preserve"> </w:t>
       </w:r>
-      <w:bookmarkStart w:id="22" w:name="_Toc172724904"/>
-      <w:r>
-        <w:rPr>
-          <w:rFonts w:asciiTheme="minorHAnsi" w:hAnsiTheme="minorHAnsi" w:cstheme="minorHAnsi"/>
-        </w:rPr>
-        <w:t>HTTP Server</w:t>
-      </w:r>
-      <w:r>
-        <w:rPr>
-          <w:rFonts w:asciiTheme="minorHAnsi" w:hAnsiTheme="minorHAnsi" w:cstheme="minorHAnsi"/>
+      <w:r>
+        <w:rPr>
+          <w:i/>
+          <w:lang w:val="en-US"/>
+        </w:rPr>
+        <w:t xml:space="preserve">(By </w:t>
+      </w:r>
+      <w:proofErr w:type="spellStart"/>
+      <w:r>
+        <w:rPr>
+          <w:i/>
+          <w:lang w:val="en-US"/>
+        </w:rPr>
+        <w:t>Matsvei</w:t>
+      </w:r>
+      <w:proofErr w:type="spellEnd"/>
+      <w:r>
+        <w:rPr>
+          <w:i/>
+          <w:lang w:val="en-US"/>
+        </w:rPr>
+        <w:t>)</w:t>
+      </w:r>
+      <w:bookmarkEnd w:id="22"/>
+    </w:p>
+    <w:p>
+      <w:pPr>
+        <w:pStyle w:val="a3"/>
+        <w:rPr>
+          <w:lang w:val="ru-RU"/>
+        </w:rPr>
+      </w:pPr>
+      <w:r>
+        <w:rPr>
+          <w:lang w:val="en-US"/>
+        </w:rPr>
+        <w:t>One of the critical aspects of this system is the efficient and accurate determination of commands based on user movements. This part provides an in-depth explanation of the logic behind sending commands to the server, combining note values, and maintaining a command history to ensure reliability and responsiveness.</w:t>
+      </w:r>
+    </w:p>
+    <w:p>
+      <w:pPr>
+        <w:pStyle w:val="a3"/>
+        <w:rPr>
+          <w:lang w:val="ru-RU"/>
+        </w:rPr>
+      </w:pPr>
+    </w:p>
+    <w:p>
+      <w:pPr>
+        <w:pStyle w:val="a3"/>
+        <w:rPr>
+          <w:b/>
+          <w:lang w:val="ru-RU"/>
+        </w:rPr>
+      </w:pPr>
+      <w:proofErr w:type="spellStart"/>
+      <w:r>
+        <w:rPr>
+          <w:b/>
+        </w:rPr>
+        <w:t>Combining</w:t>
+      </w:r>
+      <w:proofErr w:type="spellEnd"/>
+      <w:r>
+        <w:rPr>
+          <w:b/>
+        </w:rPr>
+        <w:t xml:space="preserve"> Note Value</w:t>
+      </w:r>
+    </w:p>
+    <w:p>
+      <w:pPr>
+        <w:pStyle w:val="a3"/>
+        <w:rPr>
+          <w:b/>
+          <w:lang w:val="ru-RU"/>
+        </w:rPr>
+      </w:pPr>
+    </w:p>
+    <w:p>
+      <w:pPr>
+        <w:pStyle w:val="a3"/>
+        <w:rPr>
+          <w:lang w:val="en-US"/>
+        </w:rPr>
+      </w:pPr>
+      <w:r>
+        <w:rPr>
+          <w:lang w:val="en-US"/>
+        </w:rPr>
+        <w:t xml:space="preserve">The </w:t>
+      </w:r>
+      <w:proofErr w:type="spellStart"/>
+      <w:r>
+        <w:rPr>
+          <w:rStyle w:val="HTML"/>
+          <w:rFonts w:ascii="Arial" w:eastAsia="Arial" w:hAnsi="Arial" w:cs="Arial"/>
+          <w:i/>
+          <w:lang w:val="en-US"/>
+        </w:rPr>
+        <w:t>combination_result</w:t>
+      </w:r>
+      <w:proofErr w:type="spellEnd"/>
+      <w:r>
+        <w:rPr>
+          <w:lang w:val="en-US"/>
+        </w:rPr>
+        <w:t xml:space="preserve"> function is central to interpreting detected angles and translating them into actionable commands. The function takes two integer inputs</w:t>
+      </w:r>
+      <w:proofErr w:type="gramStart"/>
+      <w:r>
+        <w:rPr>
+          <w:lang w:val="en-US"/>
+        </w:rPr>
+        <w:t>,</w:t>
+      </w:r>
+      <w:r>
+        <w:rPr>
+          <w:i/>
+          <w:lang w:val="en-US"/>
+        </w:rPr>
+        <w:t xml:space="preserve">  </w:t>
+      </w:r>
+      <w:proofErr w:type="spellStart"/>
+      <w:r>
+        <w:rPr>
+          <w:rStyle w:val="HTML"/>
+          <w:rFonts w:ascii="Arial" w:eastAsia="Arial" w:hAnsi="Arial" w:cs="Arial"/>
+          <w:i/>
+          <w:lang w:val="en-US"/>
+        </w:rPr>
+        <w:t>manuale</w:t>
+      </w:r>
+      <w:proofErr w:type="spellEnd"/>
+      <w:proofErr w:type="gramEnd"/>
+      <w:r>
+        <w:rPr>
+          <w:lang w:val="en-US"/>
+        </w:rPr>
+        <w:t xml:space="preserve"> and </w:t>
+      </w:r>
+      <w:r>
+        <w:rPr>
+          <w:rStyle w:val="HTML"/>
+          <w:rFonts w:ascii="Arial" w:eastAsia="Arial" w:hAnsi="Arial" w:cs="Arial"/>
+          <w:i/>
+          <w:lang w:val="en-US"/>
+        </w:rPr>
+        <w:t>tempo</w:t>
+      </w:r>
+      <w:r>
+        <w:rPr>
+          <w:lang w:val="en-US"/>
+        </w:rPr>
+        <w:t>, representing angles measured at the elbow and shoulder joints, respectively. These inputs are mapped to specific notes, and the combination of these notes forms a unique command.</w:t>
+      </w:r>
+    </w:p>
+    <w:p>
+      <w:pPr>
+        <w:pStyle w:val="a3"/>
+        <w:rPr>
+          <w:lang w:val="ru-RU"/>
+        </w:rPr>
+      </w:pPr>
+      <w:r>
+        <w:rPr>
+          <w:noProof/>
+          <w:lang w:eastAsia="ru-RU"/>
+        </w:rPr>
+        <w:drawing>
+          <wp:inline distT="0" distB="0" distL="0" distR="0" wp14:anchorId="5267B014" wp14:editId="6EDAD46B">
+            <wp:extent cx="5940425" cy="3321831"/>
+            <wp:effectExtent l="0" t="0" r="3175" b="0"/>
+            <wp:docPr id="5" name="Рисунок 5"/>
+            <wp:cNvGraphicFramePr>
+              <a:graphicFrameLocks xmlns:a="http://schemas.openxmlformats.org/drawingml/2006/main" noChangeAspect="1"/>
+            </wp:cNvGraphicFramePr>
+            <a:graphic xmlns:a="http://schemas.openxmlformats.org/drawingml/2006/main">
+              <a:graphicData uri="http://schemas.openxmlformats.org/drawingml/2006/picture">
+                <pic:pic xmlns:pic="http://schemas.openxmlformats.org/drawingml/2006/picture">
+                  <pic:nvPicPr>
+                    <pic:cNvPr id="0" name=""/>
+                    <pic:cNvPicPr/>
+                  </pic:nvPicPr>
+                  <pic:blipFill>
+                    <a:blip r:embed="rId13"/>
+                    <a:stretch>
+                      <a:fillRect/>
+                    </a:stretch>
+                  </pic:blipFill>
+                  <pic:spPr>
+                    <a:xfrm>
+                      <a:off x="0" y="0"/>
+                      <a:ext cx="5940425" cy="3321831"/>
+                    </a:xfrm>
+                    <a:prstGeom prst="rect">
+                      <a:avLst/>
+                    </a:prstGeom>
+                  </pic:spPr>
+                </pic:pic>
+              </a:graphicData>
+            </a:graphic>
+          </wp:inline>
+        </w:drawing>
+      </w:r>
+    </w:p>
+    <w:p>
+      <w:pPr>
+        <w:pStyle w:val="a3"/>
+        <w:rPr>
+          <w:lang w:val="ru-RU"/>
+        </w:rPr>
+      </w:pPr>
+      <w:r>
+        <w:rPr>
+          <w:lang w:val="en-US"/>
+        </w:rPr>
+        <w:t xml:space="preserve">Thus, using this function, two numbers are converted into one (according to the Meanings of values ​​table) for further sending to the server. There are 26 different combinations in total. However, in this version of the project we only need 9 (see </w:t>
+      </w:r>
+      <w:r>
+        <w:rPr>
+          <w:i/>
+          <w:lang w:val="en-US"/>
+        </w:rPr>
+        <w:t>Main Video Processing Loop</w:t>
+      </w:r>
+      <w:r>
+        <w:rPr>
+          <w:lang w:val="en-US"/>
+        </w:rPr>
+        <w:t>)</w:t>
+      </w:r>
+    </w:p>
+    <w:p>
+      <w:pPr>
+        <w:pStyle w:val="a3"/>
+        <w:rPr>
+          <w:lang w:val="ru-RU"/>
+        </w:rPr>
+      </w:pPr>
+    </w:p>
+    <w:p>
+      <w:pPr>
+        <w:pStyle w:val="a3"/>
+        <w:rPr>
+          <w:b/>
+          <w:lang w:val="ru-RU"/>
+        </w:rPr>
+      </w:pPr>
+      <w:r>
+        <w:rPr>
+          <w:b/>
+          <w:lang w:val="en-US"/>
+        </w:rPr>
+        <w:t>Sending to the server</w:t>
+      </w:r>
+    </w:p>
+    <w:p>
+      <w:pPr>
+        <w:pStyle w:val="a3"/>
+        <w:rPr>
+          <w:b/>
+          <w:lang w:val="ru-RU"/>
+        </w:rPr>
+      </w:pPr>
+    </w:p>
+    <w:p>
+      <w:pPr>
+        <w:pStyle w:val="a3"/>
+        <w:rPr>
+          <w:lang w:val="en-US"/>
+        </w:rPr>
+      </w:pPr>
+      <w:r>
+        <w:rPr>
+          <w:lang w:val="en-US"/>
+        </w:rPr>
+        <w:t xml:space="preserve">The function </w:t>
+      </w:r>
+      <w:proofErr w:type="spellStart"/>
+      <w:r>
+        <w:rPr>
+          <w:rStyle w:val="HTML"/>
+          <w:rFonts w:ascii="Arial" w:eastAsia="Arial" w:hAnsi="Arial" w:cs="Arial"/>
+          <w:i/>
+          <w:lang w:val="en-US"/>
+        </w:rPr>
+        <w:t>send_command_to_server</w:t>
+      </w:r>
+      <w:proofErr w:type="spellEnd"/>
+      <w:r>
+        <w:rPr>
+          <w:lang w:val="en-US"/>
+        </w:rPr>
+        <w:t xml:space="preserve"> handles the communication with the server. It sends the command determined by the combination of </w:t>
+      </w:r>
+      <w:proofErr w:type="spellStart"/>
+      <w:r>
+        <w:rPr>
+          <w:rStyle w:val="HTML"/>
+          <w:rFonts w:ascii="Arial" w:eastAsia="Arial" w:hAnsi="Arial" w:cs="Arial"/>
+          <w:i/>
+          <w:lang w:val="en-US"/>
+        </w:rPr>
+        <w:t>manuale</w:t>
+      </w:r>
+      <w:proofErr w:type="spellEnd"/>
+      <w:r>
+        <w:rPr>
+          <w:lang w:val="en-US"/>
+        </w:rPr>
+        <w:t xml:space="preserve"> and </w:t>
+      </w:r>
+      <w:r>
+        <w:rPr>
+          <w:rStyle w:val="HTML"/>
+          <w:rFonts w:ascii="Arial" w:eastAsia="Arial" w:hAnsi="Arial" w:cs="Arial"/>
+          <w:i/>
+          <w:lang w:val="en-US"/>
+        </w:rPr>
+        <w:t>tempo</w:t>
+      </w:r>
+      <w:r>
+        <w:rPr>
+          <w:lang w:val="en-US"/>
+        </w:rPr>
+        <w:t xml:space="preserve"> values.</w:t>
+      </w:r>
+    </w:p>
+    <w:p>
+      <w:pPr>
+        <w:pStyle w:val="a3"/>
+        <w:rPr>
+          <w:lang w:val="en-US"/>
+        </w:rPr>
+      </w:pPr>
+      <w:r>
+        <w:rPr>
+          <w:lang w:val="en-US"/>
+        </w:rPr>
+        <w:t xml:space="preserve">The function sends an </w:t>
+      </w:r>
+      <w:r>
+        <w:rPr>
+          <w:i/>
+          <w:lang w:val="en-US"/>
+        </w:rPr>
+        <w:t>HTTP POST</w:t>
+      </w:r>
+      <w:r>
+        <w:rPr>
+          <w:lang w:val="en-US"/>
+        </w:rPr>
+        <w:t xml:space="preserve"> request to the server specified by the URL. The command is sent in the </w:t>
+      </w:r>
+      <w:r>
+        <w:rPr>
+          <w:i/>
+          <w:lang w:val="en-US"/>
+        </w:rPr>
+        <w:t>JSON</w:t>
+      </w:r>
+      <w:r>
+        <w:rPr>
+          <w:lang w:val="en-US"/>
+        </w:rPr>
+        <w:t xml:space="preserve"> format, making it easy for the server to parse and interpret the data.</w:t>
+      </w:r>
+    </w:p>
+    <w:p>
+      <w:pPr>
+        <w:pStyle w:val="a3"/>
+        <w:rPr>
+          <w:lang w:val="en-US"/>
+        </w:rPr>
+      </w:pPr>
+      <w:r>
+        <w:rPr>
+          <w:lang w:val="en-US"/>
+        </w:rPr>
+        <w:t xml:space="preserve">The function includes a try-except block to handle any potential network errors. If an exception occurs, such as </w:t>
+      </w:r>
+      <w:proofErr w:type="gramStart"/>
+      <w:r>
+        <w:rPr>
+          <w:lang w:val="en-US"/>
+        </w:rPr>
+        <w:t>a connection</w:t>
+      </w:r>
+      <w:proofErr w:type="gramEnd"/>
+      <w:r>
+        <w:rPr>
+          <w:lang w:val="en-US"/>
+        </w:rPr>
+        <w:t xml:space="preserve"> timeout or server unavailability, it prints an error </w:t>
+      </w:r>
+      <w:r>
+        <w:rPr>
+          <w:lang w:val="en-US"/>
+        </w:rPr>
+        <w:lastRenderedPageBreak/>
+        <w:t>message. This is important for debugging and ensuring the system can gracefully handle communication issues without crashing.</w:t>
+      </w:r>
+    </w:p>
+    <w:p>
+      <w:pPr>
+        <w:pStyle w:val="a3"/>
+        <w:rPr>
+          <w:lang w:val="ru-RU"/>
+        </w:rPr>
+      </w:pPr>
+      <w:r>
+        <w:rPr>
+          <w:noProof/>
+          <w:lang w:eastAsia="ru-RU"/>
+        </w:rPr>
+        <w:drawing>
+          <wp:inline distT="0" distB="0" distL="0" distR="0" wp14:anchorId="5C13EEF3" wp14:editId="03C2D7A4">
+            <wp:extent cx="5940425" cy="2635761"/>
+            <wp:effectExtent l="0" t="0" r="3175" b="0"/>
+            <wp:docPr id="6" name="Рисунок 6"/>
+            <wp:cNvGraphicFramePr>
+              <a:graphicFrameLocks xmlns:a="http://schemas.openxmlformats.org/drawingml/2006/main" noChangeAspect="1"/>
+            </wp:cNvGraphicFramePr>
+            <a:graphic xmlns:a="http://schemas.openxmlformats.org/drawingml/2006/main">
+              <a:graphicData uri="http://schemas.openxmlformats.org/drawingml/2006/picture">
+                <pic:pic xmlns:pic="http://schemas.openxmlformats.org/drawingml/2006/picture">
+                  <pic:nvPicPr>
+                    <pic:cNvPr id="0" name=""/>
+                    <pic:cNvPicPr/>
+                  </pic:nvPicPr>
+                  <pic:blipFill>
+                    <a:blip r:embed="rId14"/>
+                    <a:stretch>
+                      <a:fillRect/>
+                    </a:stretch>
+                  </pic:blipFill>
+                  <pic:spPr>
+                    <a:xfrm>
+                      <a:off x="0" y="0"/>
+                      <a:ext cx="5940425" cy="2635761"/>
+                    </a:xfrm>
+                    <a:prstGeom prst="rect">
+                      <a:avLst/>
+                    </a:prstGeom>
+                  </pic:spPr>
+                </pic:pic>
+              </a:graphicData>
+            </a:graphic>
+          </wp:inline>
+        </w:drawing>
+      </w:r>
+    </w:p>
+    <w:p>
+      <w:pPr>
+        <w:pStyle w:val="a3"/>
+        <w:rPr>
+          <w:lang w:val="ru-RU"/>
+        </w:rPr>
+      </w:pPr>
+    </w:p>
+    <w:p>
+      <w:pPr>
+        <w:pStyle w:val="a3"/>
+        <w:rPr>
+          <w:b/>
+          <w:lang w:val="ru-RU"/>
+        </w:rPr>
+      </w:pPr>
+      <w:r>
+        <w:rPr>
+          <w:b/>
+          <w:lang w:val="en-US"/>
+        </w:rPr>
+        <w:t>Main Video Processing Loop</w:t>
+      </w:r>
+    </w:p>
+    <w:p>
+      <w:pPr>
+        <w:pStyle w:val="a3"/>
+        <w:rPr>
+          <w:b/>
+          <w:lang w:val="ru-RU"/>
+        </w:rPr>
+      </w:pPr>
+    </w:p>
+    <w:p>
+      <w:pPr>
+        <w:pStyle w:val="a3"/>
+        <w:rPr>
+          <w:lang w:val="en-US"/>
+        </w:rPr>
+      </w:pPr>
+      <w:r>
+        <w:rPr>
+          <w:lang w:val="en-US"/>
+        </w:rPr>
+        <w:t xml:space="preserve">To ensure that the commands sent to the server are reliable and reflect intentional user actions, the system maintains a history of recent commands using a </w:t>
+      </w:r>
+      <w:proofErr w:type="spellStart"/>
+      <w:r>
+        <w:rPr>
+          <w:i/>
+          <w:lang w:val="en-US"/>
+        </w:rPr>
+        <w:t>deque</w:t>
+      </w:r>
+      <w:proofErr w:type="spellEnd"/>
+      <w:r>
+        <w:rPr>
+          <w:lang w:val="en-US"/>
+        </w:rPr>
+        <w:t xml:space="preserve"> (double-ended queue). This mechanism helps filter out accidental movements and ensures that only consistent and repeated actions trigger a command.</w:t>
+      </w:r>
+    </w:p>
+    <w:p>
+      <w:pPr>
+        <w:pStyle w:val="a3"/>
+        <w:rPr>
+          <w:lang w:val="en-US"/>
+        </w:rPr>
+      </w:pPr>
+      <w:r>
+        <w:rPr>
+          <w:lang w:val="en-US"/>
+        </w:rPr>
+        <w:t xml:space="preserve">The </w:t>
+      </w:r>
+      <w:proofErr w:type="spellStart"/>
+      <w:r>
+        <w:rPr>
+          <w:rStyle w:val="HTML"/>
+          <w:rFonts w:ascii="Arial" w:eastAsia="Arial" w:hAnsi="Arial" w:cs="Arial"/>
+          <w:i/>
+          <w:lang w:val="en-US"/>
+        </w:rPr>
+        <w:t>command_history</w:t>
+      </w:r>
+      <w:proofErr w:type="spellEnd"/>
+      <w:r>
+        <w:rPr>
+          <w:lang w:val="en-US"/>
         </w:rPr>
         <w:t xml:space="preserve"> </w:t>
       </w:r>
-      <w:r>
-        <w:rPr>
-          <w:rFonts w:asciiTheme="minorHAnsi" w:hAnsiTheme="minorHAnsi" w:cstheme="minorHAnsi"/>
+      <w:proofErr w:type="spellStart"/>
+      <w:r>
+        <w:rPr>
+          <w:lang w:val="en-US"/>
+        </w:rPr>
+        <w:t>deque</w:t>
+      </w:r>
+      <w:proofErr w:type="spellEnd"/>
+      <w:r>
+        <w:rPr>
+          <w:lang w:val="en-US"/>
+        </w:rPr>
+        <w:t xml:space="preserve"> is initialized with a maximum length of 25. This means it will store the last 25 commands detected by the system. The choice of 25 is a balance between responsiveness and noise filtering, ensuring that the system reacts quickly to intentional movements while ignoring brief or accidental actions.</w:t>
+      </w:r>
+    </w:p>
+    <w:p>
+      <w:pPr>
+        <w:pStyle w:val="a3"/>
+        <w:rPr>
+          <w:lang w:val="en-US"/>
+        </w:rPr>
+      </w:pPr>
+      <w:r>
+        <w:rPr>
+          <w:lang w:val="en-US"/>
+        </w:rPr>
+        <w:t xml:space="preserve">The </w:t>
+      </w:r>
+      <w:proofErr w:type="spellStart"/>
+      <w:r>
+        <w:rPr>
           <w:i/>
+          <w:lang w:val="en-US"/>
+        </w:rPr>
+        <w:t>last_command</w:t>
+      </w:r>
+      <w:proofErr w:type="spellEnd"/>
+      <w:r>
+        <w:rPr>
+          <w:lang w:val="en-US"/>
+        </w:rPr>
+        <w:t xml:space="preserve"> variable plays a key role in the logic of sending commands to the server. It is used to keep track of the last command sent and prevent duplicate commands from being sent without explicit modification. </w:t>
+      </w:r>
+    </w:p>
+    <w:p>
+      <w:pPr>
+        <w:pStyle w:val="a3"/>
+        <w:rPr>
+          <w:lang w:val="en-US"/>
+        </w:rPr>
+      </w:pPr>
+      <w:r>
+        <w:rPr>
+          <w:lang w:val="en-US"/>
+        </w:rPr>
+        <w:t xml:space="preserve">The </w:t>
+      </w:r>
+      <w:proofErr w:type="spellStart"/>
+      <w:r>
+        <w:rPr>
+          <w:i/>
+          <w:lang w:val="en-US"/>
+        </w:rPr>
+        <w:t>command_allowed</w:t>
+      </w:r>
+      <w:proofErr w:type="spellEnd"/>
+      <w:r>
+        <w:rPr>
+          <w:lang w:val="en-US"/>
+        </w:rPr>
+        <w:t xml:space="preserve"> variable is used to control the state of the system, determining when it can send commands to the server and when it cannot.</w:t>
+      </w:r>
+    </w:p>
+    <w:p>
+      <w:pPr>
+        <w:pStyle w:val="a3"/>
+        <w:rPr>
+          <w:lang w:val="en-US"/>
+        </w:rPr>
+      </w:pPr>
+    </w:p>
+    <w:p>
+      <w:pPr>
+        <w:pStyle w:val="a3"/>
+        <w:rPr>
+          <w:lang w:val="en-US"/>
+        </w:rPr>
+      </w:pPr>
+      <w:r>
+        <w:rPr>
+          <w:lang w:val="en-US"/>
+        </w:rPr>
+        <w:t xml:space="preserve">Since this version of the project has only 8 supported commands, the system first checks whether the command is supported. After this, the system adds the command number to the history </w:t>
+      </w:r>
+    </w:p>
+    <w:p>
+      <w:pPr>
+        <w:pStyle w:val="a3"/>
+      </w:pPr>
+      <w:r>
+        <w:rPr>
+          <w:noProof/>
+          <w:lang w:eastAsia="ru-RU"/>
+        </w:rPr>
+        <w:drawing>
+          <wp:inline distT="0" distB="0" distL="0" distR="0" wp14:anchorId="64D76F9D" wp14:editId="37E1CD5A">
+            <wp:extent cx="3143249" cy="742950"/>
+            <wp:effectExtent l="0" t="0" r="635" b="0"/>
+            <wp:docPr id="27" name="Рисунок 27"/>
+            <wp:cNvGraphicFramePr>
+              <a:graphicFrameLocks xmlns:a="http://schemas.openxmlformats.org/drawingml/2006/main" noChangeAspect="1"/>
+            </wp:cNvGraphicFramePr>
+            <a:graphic xmlns:a="http://schemas.openxmlformats.org/drawingml/2006/main">
+              <a:graphicData uri="http://schemas.openxmlformats.org/drawingml/2006/picture">
+                <pic:pic xmlns:pic="http://schemas.openxmlformats.org/drawingml/2006/picture">
+                  <pic:nvPicPr>
+                    <pic:cNvPr id="0" name="one.PNG"/>
+                    <pic:cNvPicPr/>
+                  </pic:nvPicPr>
+                  <pic:blipFill>
+                    <a:blip r:embed="rId15">
+                      <a:extLst>
+                        <a:ext uri="{28A0092B-C50C-407E-A947-70E740481C1C}">
+                          <a14:useLocalDpi xmlns:a14="http://schemas.microsoft.com/office/drawing/2010/main" val="0"/>
+                        </a:ext>
+                      </a:extLst>
+                    </a:blip>
+                    <a:stretch>
+                      <a:fillRect/>
+                    </a:stretch>
+                  </pic:blipFill>
+                  <pic:spPr>
+                    <a:xfrm>
+                      <a:off x="0" y="0"/>
+                      <a:ext cx="3143522" cy="743015"/>
+                    </a:xfrm>
+                    <a:prstGeom prst="rect">
+                      <a:avLst/>
+                    </a:prstGeom>
+                  </pic:spPr>
+                </pic:pic>
+              </a:graphicData>
+            </a:graphic>
+          </wp:inline>
+        </w:drawing>
+      </w:r>
+    </w:p>
+    <w:p>
+      <w:pPr>
+        <w:pStyle w:val="a3"/>
+        <w:rPr>
+          <w:lang w:val="en-US"/>
+        </w:rPr>
+      </w:pPr>
+      <w:r>
+        <w:rPr>
+          <w:lang w:val="en-US"/>
+        </w:rPr>
+        <w:t xml:space="preserve">To indicate the beginning and end of the game, there was a designated start/end pose (arms up). It is designated by command 0. The system checks whether the deck is filled with number 0 and whether 0 is not the last command. </w:t>
+      </w:r>
+      <w:proofErr w:type="gramStart"/>
+      <w:r>
+        <w:rPr>
+          <w:lang w:val="en-US"/>
+        </w:rPr>
+        <w:t xml:space="preserve">The status of the variable </w:t>
+      </w:r>
+      <w:proofErr w:type="spellStart"/>
+      <w:r>
+        <w:rPr>
+          <w:i/>
+          <w:lang w:val="en-US"/>
+        </w:rPr>
+        <w:t>command_allowed</w:t>
+      </w:r>
+      <w:proofErr w:type="spellEnd"/>
+      <w:r>
+        <w:rPr>
+          <w:lang w:val="en-US"/>
+        </w:rPr>
+        <w:t xml:space="preserve"> changes.</w:t>
+      </w:r>
+      <w:proofErr w:type="gramEnd"/>
+      <w:r>
+        <w:rPr>
+          <w:lang w:val="en-US"/>
+        </w:rPr>
+        <w:t xml:space="preserve"> If this position is used for the first time, then “ready” is printed and a thread is started that sends the value 0 to the server. If this pose is used a </w:t>
+      </w:r>
+      <w:r>
+        <w:rPr>
+          <w:lang w:val="en-US"/>
+        </w:rPr>
+        <w:lastRenderedPageBreak/>
+        <w:t>second time, “end” is printed and a thread is started that sends the value 26 to the server. After this the history is cleaned</w:t>
+      </w:r>
+    </w:p>
+    <w:p>
+      <w:pPr>
+        <w:pStyle w:val="a3"/>
+      </w:pPr>
+      <w:r>
+        <w:rPr>
+          <w:noProof/>
+          <w:lang w:eastAsia="ru-RU"/>
+        </w:rPr>
+        <w:drawing>
+          <wp:inline distT="0" distB="0" distL="0" distR="0" wp14:anchorId="6C8FBE13" wp14:editId="617BCA93">
+            <wp:extent cx="5940425" cy="1830134"/>
+            <wp:effectExtent l="0" t="0" r="3175" b="0"/>
+            <wp:docPr id="28" name="Рисунок 28"/>
+            <wp:cNvGraphicFramePr>
+              <a:graphicFrameLocks xmlns:a="http://schemas.openxmlformats.org/drawingml/2006/main" noChangeAspect="1"/>
+            </wp:cNvGraphicFramePr>
+            <a:graphic xmlns:a="http://schemas.openxmlformats.org/drawingml/2006/main">
+              <a:graphicData uri="http://schemas.openxmlformats.org/drawingml/2006/picture">
+                <pic:pic xmlns:pic="http://schemas.openxmlformats.org/drawingml/2006/picture">
+                  <pic:nvPicPr>
+                    <pic:cNvPr id="0" name=""/>
+                    <pic:cNvPicPr/>
+                  </pic:nvPicPr>
+                  <pic:blipFill>
+                    <a:blip r:embed="rId16"/>
+                    <a:stretch>
+                      <a:fillRect/>
+                    </a:stretch>
+                  </pic:blipFill>
+                  <pic:spPr>
+                    <a:xfrm>
+                      <a:off x="0" y="0"/>
+                      <a:ext cx="5940425" cy="1830134"/>
+                    </a:xfrm>
+                    <a:prstGeom prst="rect">
+                      <a:avLst/>
+                    </a:prstGeom>
+                  </pic:spPr>
+                </pic:pic>
+              </a:graphicData>
+            </a:graphic>
+          </wp:inline>
+        </w:drawing>
+      </w:r>
+    </w:p>
+    <w:p>
+      <w:pPr>
+        <w:pStyle w:val="a3"/>
+        <w:rPr>
+          <w:lang w:val="en-US"/>
+        </w:rPr>
+      </w:pPr>
+      <w:r>
+        <w:rPr>
+          <w:lang w:val="en-US"/>
+        </w:rPr>
+        <w:t>The system checks each time whether the starting pose has already been used. If so, then the history begins to fill with commands. When the history is filled with the same command, this command is sent to the server, the history is cleared</w:t>
+      </w:r>
+    </w:p>
+    <w:p>
+      <w:pPr>
+        <w:pStyle w:val="a3"/>
+        <w:rPr>
+          <w:lang w:val="ru-RU"/>
+        </w:rPr>
+      </w:pPr>
+      <w:r>
+        <w:rPr>
+          <w:noProof/>
+          <w:lang w:eastAsia="ru-RU"/>
+        </w:rPr>
+        <w:drawing>
+          <wp:inline distT="0" distB="0" distL="0" distR="0" wp14:anchorId="651743FD" wp14:editId="489831E7">
+            <wp:extent cx="5940425" cy="918439"/>
+            <wp:effectExtent l="0" t="0" r="3175" b="0"/>
+            <wp:docPr id="29" name="Рисунок 29"/>
+            <wp:cNvGraphicFramePr>
+              <a:graphicFrameLocks xmlns:a="http://schemas.openxmlformats.org/drawingml/2006/main" noChangeAspect="1"/>
+            </wp:cNvGraphicFramePr>
+            <a:graphic xmlns:a="http://schemas.openxmlformats.org/drawingml/2006/main">
+              <a:graphicData uri="http://schemas.openxmlformats.org/drawingml/2006/picture">
+                <pic:pic xmlns:pic="http://schemas.openxmlformats.org/drawingml/2006/picture">
+                  <pic:nvPicPr>
+                    <pic:cNvPr id="0" name=""/>
+                    <pic:cNvPicPr/>
+                  </pic:nvPicPr>
+                  <pic:blipFill>
+                    <a:blip r:embed="rId17"/>
+                    <a:stretch>
+                      <a:fillRect/>
+                    </a:stretch>
+                  </pic:blipFill>
+                  <pic:spPr>
+                    <a:xfrm>
+                      <a:off x="0" y="0"/>
+                      <a:ext cx="5940425" cy="918439"/>
+                    </a:xfrm>
+                    <a:prstGeom prst="rect">
+                      <a:avLst/>
+                    </a:prstGeom>
+                  </pic:spPr>
+                </pic:pic>
+              </a:graphicData>
+            </a:graphic>
+          </wp:inline>
+        </w:drawing>
+      </w:r>
+    </w:p>
+    <w:p>
+      <w:pPr>
+        <w:pStyle w:val="a3"/>
+        <w:rPr>
+          <w:lang w:val="en-US"/>
+        </w:rPr>
+      </w:pPr>
+    </w:p>
+    <w:p>
+      <w:pPr>
+        <w:pStyle w:val="a3"/>
+        <w:rPr>
+          <w:lang w:val="en-US"/>
+        </w:rPr>
+      </w:pPr>
+    </w:p>
+    <w:p>
+      <w:pPr>
+        <w:pStyle w:val="a3"/>
+        <w:rPr>
+          <w:lang w:val="en-US"/>
+        </w:rPr>
+      </w:pPr>
+      <w:r>
+        <w:rPr>
+          <w:lang w:val="en-US"/>
+        </w:rPr>
+        <w:t xml:space="preserve">This section of the code is designed to ensure that commands sent to the server are intentional and consistent. The use of a </w:t>
+      </w:r>
+      <w:proofErr w:type="spellStart"/>
+      <w:r>
+        <w:rPr>
+          <w:lang w:val="en-US"/>
+        </w:rPr>
+        <w:t>deque</w:t>
+      </w:r>
+      <w:proofErr w:type="spellEnd"/>
+      <w:r>
+        <w:rPr>
+          <w:lang w:val="en-US"/>
+        </w:rPr>
+        <w:t xml:space="preserve"> to maintain command history, combined with multiple conditional checks, helps filter out accidental or transient movements. The toggling mechanism allows the system to switch between active and inactive states based on user poses, providing a robust and reliable method for controlling command sending.</w:t>
+      </w:r>
+    </w:p>
+    <w:p>
+      <w:pPr>
+        <w:pStyle w:val="a3"/>
+        <w:rPr>
+          <w:lang w:val="en-US"/>
+        </w:rPr>
+      </w:pPr>
+    </w:p>
+    <w:p>
+      <w:pPr>
+        <w:pStyle w:val="a3"/>
+        <w:rPr>
+          <w:lang w:val="en-US"/>
+        </w:rPr>
+      </w:pPr>
+      <w:r>
+        <w:rPr>
+          <w:lang w:val="en-US"/>
+        </w:rPr>
+        <w:t>Below you can see a visual representation of the algorithm</w:t>
+      </w:r>
+    </w:p>
+    <w:p>
+      <w:pPr>
+        <w:rPr>
+          <w:lang w:val="ru-RU"/>
+        </w:rPr>
+      </w:pPr>
+    </w:p>
+    <w:p>
+      <w:pPr>
+        <w:rPr>
+          <w:lang w:val="ru-RU"/>
+        </w:rPr>
+      </w:pPr>
+    </w:p>
+    <w:p>
+      <w:pPr>
+        <w:rPr>
+          <w:lang w:val="ru-RU"/>
+        </w:rPr>
+      </w:pPr>
+    </w:p>
+    <w:p>
+      <w:pPr>
+        <w:rPr>
+          <w:lang w:val="ru-RU"/>
+        </w:rPr>
+      </w:pPr>
+    </w:p>
+    <w:p>
+      <w:pPr>
+        <w:rPr>
+          <w:lang w:val="ru-RU"/>
+        </w:rPr>
+      </w:pPr>
+    </w:p>
+    <w:p>
+      <w:pPr>
+        <w:rPr>
+          <w:lang w:val="ru-RU"/>
+        </w:rPr>
+      </w:pPr>
+    </w:p>
+    <w:p>
+      <w:pPr>
+        <w:rPr>
+          <w:lang w:val="ru-RU"/>
+        </w:rPr>
+      </w:pPr>
+    </w:p>
+    <w:p>
+      <w:pPr>
+        <w:rPr>
+          <w:lang w:val="ru-RU"/>
+        </w:rPr>
+      </w:pPr>
+    </w:p>
+    <w:p>
+      <w:pPr>
+        <w:rPr>
+          <w:lang w:val="ru-RU"/>
+        </w:rPr>
+      </w:pPr>
+    </w:p>
+    <w:p>
+      <w:pPr>
+        <w:rPr>
+          <w:lang w:val="ru-RU"/>
+        </w:rPr>
+      </w:pPr>
+    </w:p>
+    <w:p>
+      <w:pPr>
+        <w:pStyle w:val="a3"/>
+      </w:pPr>
+    </w:p>
+    <w:p>
+      <w:pPr>
+        <w:pStyle w:val="a3"/>
+        <w:jc w:val="center"/>
+        <w:rPr>
+          <w:b/>
+          <w:sz w:val="36"/>
+          <w:lang w:val="en-US"/>
+        </w:rPr>
+      </w:pPr>
+      <w:r>
+        <w:rPr>
+          <w:noProof/>
+          <w:lang w:eastAsia="ru-RU"/>
+        </w:rPr>
+        <w:lastRenderedPageBreak/>
+        <w:drawing>
+          <wp:anchor distT="0" distB="0" distL="114300" distR="114300" simplePos="0" relativeHeight="251664384" behindDoc="0" locked="0" layoutInCell="1" allowOverlap="1" wp14:anchorId="17906A90" wp14:editId="1A54DABA">
+            <wp:simplePos x="0" y="0"/>
+            <wp:positionH relativeFrom="column">
+              <wp:posOffset>-443230</wp:posOffset>
+            </wp:positionH>
+            <wp:positionV relativeFrom="paragraph">
+              <wp:posOffset>248920</wp:posOffset>
+            </wp:positionV>
+            <wp:extent cx="6701790" cy="8375650"/>
+            <wp:effectExtent l="0" t="0" r="3810" b="6350"/>
+            <wp:wrapNone/>
+            <wp:docPr id="30" name="Рисунок 30"/>
+            <wp:cNvGraphicFramePr>
+              <a:graphicFrameLocks xmlns:a="http://schemas.openxmlformats.org/drawingml/2006/main" noChangeAspect="1"/>
+            </wp:cNvGraphicFramePr>
+            <a:graphic xmlns:a="http://schemas.openxmlformats.org/drawingml/2006/main">
+              <a:graphicData uri="http://schemas.openxmlformats.org/drawingml/2006/picture">
+                <pic:pic xmlns:pic="http://schemas.openxmlformats.org/drawingml/2006/picture">
+                  <pic:nvPicPr>
+                    <pic:cNvPr id="0" name="Logic.drawio.png"/>
+                    <pic:cNvPicPr/>
+                  </pic:nvPicPr>
+                  <pic:blipFill>
+                    <a:blip r:embed="rId18">
+                      <a:extLst>
+                        <a:ext uri="{28A0092B-C50C-407E-A947-70E740481C1C}">
+                          <a14:useLocalDpi xmlns:a14="http://schemas.microsoft.com/office/drawing/2010/main" val="0"/>
+                        </a:ext>
+                      </a:extLst>
+                    </a:blip>
+                    <a:stretch>
+                      <a:fillRect/>
+                    </a:stretch>
+                  </pic:blipFill>
+                  <pic:spPr>
+                    <a:xfrm>
+                      <a:off x="0" y="0"/>
+                      <a:ext cx="6701790" cy="8375650"/>
+                    </a:xfrm>
+                    <a:prstGeom prst="rect">
+                      <a:avLst/>
+                    </a:prstGeom>
+                  </pic:spPr>
+                </pic:pic>
+              </a:graphicData>
+            </a:graphic>
+            <wp14:sizeRelH relativeFrom="page">
+              <wp14:pctWidth>0</wp14:pctWidth>
+            </wp14:sizeRelH>
+            <wp14:sizeRelV relativeFrom="page">
+              <wp14:pctHeight>0</wp14:pctHeight>
+            </wp14:sizeRelV>
+          </wp:anchor>
+        </w:drawing>
+      </w:r>
+      <w:r>
+        <w:rPr>
+          <w:b/>
+          <w:sz w:val="36"/>
+          <w:lang w:val="en-US"/>
+        </w:rPr>
+        <w:t xml:space="preserve">Command </w:t>
+      </w:r>
+      <w:proofErr w:type="gramStart"/>
+      <w:r>
+        <w:rPr>
+          <w:b/>
+          <w:sz w:val="36"/>
+          <w:lang w:val="en-US"/>
+        </w:rPr>
+        <w:t>Sending  Logic</w:t>
+      </w:r>
+      <w:proofErr w:type="gramEnd"/>
+    </w:p>
+    <w:p>
+      <w:pPr>
+        <w:pStyle w:val="aa"/>
+        <w:rPr>
+          <w:lang w:val="en-US"/>
+        </w:rPr>
+      </w:pPr>
+    </w:p>
+    <w:p>
+      <w:pPr>
+        <w:rPr>
+          <w:lang w:val="ru-RU"/>
+        </w:rPr>
+      </w:pPr>
+    </w:p>
+    <w:p>
+      <w:pPr>
+        <w:rPr>
+          <w:lang w:val="ru-RU"/>
+        </w:rPr>
+      </w:pPr>
+    </w:p>
+    <w:p>
+      <w:pPr>
+        <w:pStyle w:val="aa"/>
+        <w:rPr>
+          <w:b/>
+          <w:lang w:val="en-US"/>
+        </w:rPr>
+      </w:pPr>
+    </w:p>
+    <w:p>
+      <w:pPr>
+        <w:ind w:left="360"/>
+        <w:rPr>
+          <w:b/>
+          <w:lang w:val="en-US"/>
+        </w:rPr>
+      </w:pPr>
+    </w:p>
+    <w:p>
+      <w:pPr>
+        <w:rPr>
+          <w:lang w:val="ru-RU"/>
+        </w:rPr>
+      </w:pPr>
+    </w:p>
+    <w:p>
+      <w:pPr>
+        <w:spacing w:before="240" w:after="240"/>
+        <w:rPr>
+          <w:rFonts w:asciiTheme="minorHAnsi" w:hAnsiTheme="minorHAnsi" w:cstheme="minorHAnsi"/>
+          <w:lang w:val="en-US"/>
+        </w:rPr>
+      </w:pPr>
+    </w:p>
+    <w:p>
+      <w:pPr>
+        <w:spacing w:before="240" w:after="240"/>
+        <w:rPr>
+          <w:rFonts w:asciiTheme="minorHAnsi" w:hAnsiTheme="minorHAnsi" w:cstheme="minorHAnsi"/>
+          <w:lang w:val="en-US"/>
+        </w:rPr>
+      </w:pPr>
+    </w:p>
+    <w:p>
+      <w:pPr>
+        <w:spacing w:before="240" w:after="240"/>
+        <w:rPr>
+          <w:rFonts w:asciiTheme="minorHAnsi" w:hAnsiTheme="minorHAnsi" w:cstheme="minorHAnsi"/>
+          <w:lang w:val="en-US"/>
+        </w:rPr>
+      </w:pPr>
+    </w:p>
+    <w:p>
+      <w:pPr>
+        <w:spacing w:before="240" w:after="240"/>
+        <w:rPr>
+          <w:rFonts w:asciiTheme="minorHAnsi" w:hAnsiTheme="minorHAnsi" w:cstheme="minorHAnsi"/>
+          <w:lang w:val="en-US"/>
+        </w:rPr>
+      </w:pPr>
+    </w:p>
+    <w:p>
+      <w:pPr>
+        <w:spacing w:before="240" w:after="240"/>
+        <w:rPr>
+          <w:rFonts w:asciiTheme="minorHAnsi" w:hAnsiTheme="minorHAnsi" w:cstheme="minorHAnsi"/>
+          <w:lang w:val="en-US"/>
+        </w:rPr>
+      </w:pPr>
+    </w:p>
+    <w:p>
+      <w:pPr>
+        <w:spacing w:before="240" w:after="240"/>
+        <w:rPr>
+          <w:rFonts w:asciiTheme="minorHAnsi" w:hAnsiTheme="minorHAnsi" w:cstheme="minorHAnsi"/>
+          <w:lang w:val="en-US"/>
+        </w:rPr>
+      </w:pPr>
+    </w:p>
+    <w:p>
+      <w:pPr>
+        <w:spacing w:before="240" w:after="240"/>
+        <w:rPr>
+          <w:rFonts w:asciiTheme="minorHAnsi" w:hAnsiTheme="minorHAnsi" w:cstheme="minorHAnsi"/>
+          <w:lang w:val="en-US"/>
+        </w:rPr>
+      </w:pPr>
+    </w:p>
+    <w:p>
+      <w:pPr>
+        <w:spacing w:before="240" w:after="240"/>
+        <w:rPr>
+          <w:rFonts w:asciiTheme="minorHAnsi" w:hAnsiTheme="minorHAnsi" w:cstheme="minorHAnsi"/>
+          <w:lang w:val="en-US"/>
+        </w:rPr>
+      </w:pPr>
+    </w:p>
+    <w:p>
+      <w:pPr>
+        <w:spacing w:before="240" w:after="240"/>
+        <w:rPr>
+          <w:rFonts w:asciiTheme="minorHAnsi" w:hAnsiTheme="minorHAnsi" w:cstheme="minorHAnsi"/>
+          <w:lang w:val="en-US"/>
+        </w:rPr>
+      </w:pPr>
+    </w:p>
+    <w:p>
+      <w:pPr>
+        <w:rPr>
+          <w:lang w:val="en-US"/>
+        </w:rPr>
+      </w:pPr>
+    </w:p>
+    <w:p>
+      <w:pPr>
+        <w:rPr>
+          <w:lang w:val="en-US"/>
+        </w:rPr>
+      </w:pPr>
+    </w:p>
+    <w:p>
+      <w:pPr>
+        <w:rPr>
+          <w:lang w:val="en-US"/>
+        </w:rPr>
+      </w:pPr>
+    </w:p>
+    <w:p>
+      <w:pPr>
+        <w:rPr>
+          <w:lang w:val="en-US"/>
+        </w:rPr>
+      </w:pPr>
+    </w:p>
+    <w:p>
+      <w:pPr>
+        <w:rPr>
+          <w:lang w:val="en-US"/>
+        </w:rPr>
+      </w:pPr>
+    </w:p>
+    <w:p>
+      <w:pPr>
+        <w:rPr>
+          <w:lang w:val="en-US"/>
+        </w:rPr>
+      </w:pPr>
+    </w:p>
+    <w:p>
+      <w:pPr>
+        <w:pStyle w:val="1"/>
+        <w:rPr>
+          <w:lang w:val="en-US"/>
+        </w:rPr>
+      </w:pPr>
+    </w:p>
+    <w:p>
+      <w:pPr>
+        <w:rPr>
+          <w:lang w:val="en-US"/>
+        </w:rPr>
+      </w:pPr>
+    </w:p>
+    <w:p>
+      <w:pPr>
+        <w:rPr>
+          <w:lang w:val="en-US"/>
+        </w:rPr>
+      </w:pPr>
+    </w:p>
+    <w:p>
+      <w:pPr>
+        <w:rPr>
+          <w:lang w:val="en-US"/>
+        </w:rPr>
+      </w:pPr>
+    </w:p>
+    <w:p>
+      <w:pPr>
+        <w:rPr>
+          <w:lang w:val="en-US"/>
+        </w:rPr>
+      </w:pPr>
+    </w:p>
+    <w:p>
+      <w:pPr>
+        <w:rPr>
+          <w:lang w:val="en-US"/>
+        </w:rPr>
+      </w:pPr>
+    </w:p>
+    <w:p>
+      <w:pPr>
+        <w:pStyle w:val="1"/>
+        <w:numPr>
+          <w:ilvl w:val="0"/>
+          <w:numId w:val="5"/>
+        </w:numPr>
+        <w:rPr>
+          <w:rFonts w:asciiTheme="minorHAnsi" w:hAnsiTheme="minorHAnsi" w:cstheme="minorHAnsi"/>
+          <w:i/>
+        </w:rPr>
+      </w:pPr>
+      <w:r>
+        <w:rPr>
+          <w:lang w:val="en-US"/>
+        </w:rPr>
+        <w:lastRenderedPageBreak/>
+        <w:t xml:space="preserve"> </w:t>
+      </w:r>
+      <w:bookmarkStart w:id="23" w:name="_Toc172725616"/>
+      <w:r>
+        <w:rPr>
+          <w:rFonts w:asciiTheme="minorHAnsi" w:hAnsiTheme="minorHAnsi" w:cstheme="minorHAnsi"/>
+        </w:rPr>
+        <w:t>Organ</w:t>
+      </w:r>
+      <w:r>
+        <w:rPr>
+          <w:rFonts w:asciiTheme="minorHAnsi" w:hAnsiTheme="minorHAnsi" w:cstheme="minorHAnsi"/>
+        </w:rPr>
+        <w:t xml:space="preserve"> Server</w:t>
+      </w:r>
+      <w:r>
+        <w:rPr>
+          <w:rFonts w:asciiTheme="minorHAnsi" w:hAnsiTheme="minorHAnsi" w:cstheme="minorHAnsi"/>
+        </w:rPr>
+        <w:t xml:space="preserve"> </w:t>
+      </w:r>
+      <w:r>
+        <w:rPr>
+          <w:rFonts w:asciiTheme="minorHAnsi" w:hAnsiTheme="minorHAnsi" w:cstheme="minorHAnsi"/>
+          <w:i/>
         </w:rPr>
         <w:t>(</w:t>
       </w:r>
@@ -6240,7 +7924,7 @@
         </w:rPr>
         <w:t xml:space="preserve"> Kirill)</w:t>
       </w:r>
-      <w:bookmarkEnd w:id="22"/>
+      <w:bookmarkEnd w:id="23"/>
     </w:p>
     <w:p>
       <w:pPr>
@@ -6273,7 +7957,7 @@
           <w:lang w:val="en-US"/>
         </w:rPr>
       </w:pPr>
-      <w:bookmarkStart w:id="23" w:name="_Toc172724905"/>
+      <w:bookmarkStart w:id="24" w:name="_Toc172725617"/>
       <w:proofErr w:type="gramStart"/>
       <w:r>
         <w:rPr>
@@ -6281,7 +7965,7 @@
         </w:rPr>
         <w:t>Technologies and reasoning.</w:t>
       </w:r>
-      <w:bookmarkEnd w:id="23"/>
+      <w:bookmarkEnd w:id="24"/>
       <w:proofErr w:type="gramEnd"/>
     </w:p>
     <w:p>
@@ -6371,7 +8055,6 @@
           <w:b/>
           <w:lang w:val="en-US"/>
         </w:rPr>
-        <w:lastRenderedPageBreak/>
         <w:t>Gradle</w:t>
       </w:r>
       <w:proofErr w:type="spellEnd"/>
@@ -6784,14 +8467,14 @@
           <w:lang w:val="en-US"/>
         </w:rPr>
       </w:pPr>
-      <w:bookmarkStart w:id="24" w:name="_Toc172724906"/>
+      <w:bookmarkStart w:id="25" w:name="_Toc172725618"/>
       <w:r>
         <w:rPr>
           <w:lang w:val="en-US"/>
         </w:rPr>
         <w:t>Server Architecture</w:t>
       </w:r>
-      <w:bookmarkEnd w:id="24"/>
+      <w:bookmarkEnd w:id="25"/>
     </w:p>
     <w:p>
       <w:pPr>
@@ -6920,11 +8603,11 @@
           <w:numId w:val="5"/>
         </w:numPr>
       </w:pPr>
-      <w:bookmarkStart w:id="25" w:name="_Toc172724907"/>
+      <w:bookmarkStart w:id="26" w:name="_Toc172725619"/>
       <w:r>
         <w:t>Controllers</w:t>
       </w:r>
-      <w:bookmarkEnd w:id="25"/>
+      <w:bookmarkEnd w:id="26"/>
     </w:p>
     <w:p>
       <w:pPr>
@@ -7007,14 +8690,7 @@
         <w:rPr>
           <w:lang w:val="en-US"/>
         </w:rPr>
-        <w:t xml:space="preserve">. This controller provides </w:t>
-      </w:r>
-      <w:r>
-        <w:rPr>
-          <w:lang w:val="en-US"/>
-        </w:rPr>
-        <w:lastRenderedPageBreak/>
-        <w:t>functionality through two HTTP methods on the /consumer endpoint.</w:t>
+        <w:t>. This controller provides functionality through two HTTP methods on the /consumer endpoint.</w:t>
       </w:r>
     </w:p>
     <w:p>
@@ -7047,7 +8723,7 @@
                     </pic:cNvPicPr>
                   </pic:nvPicPr>
                   <pic:blipFill>
-                    <a:blip r:embed="rId13">
+                    <a:blip r:embed="rId19">
                       <a:extLst>
                         <a:ext uri="{28A0092B-C50C-407E-A947-70E740481C1C}">
                           <a14:useLocalDpi xmlns:a14="http://schemas.microsoft.com/office/drawing/2010/main" val="0"/>
@@ -7089,7 +8765,28 @@
     <w:p>
       <w:pPr>
         <w:rPr>
-          <w:lang w:val="en-US"/>
+          <w:lang w:val="ru-RU"/>
+        </w:rPr>
+      </w:pPr>
+    </w:p>
+    <w:p>
+      <w:pPr>
+        <w:rPr>
+          <w:lang w:val="ru-RU"/>
+        </w:rPr>
+      </w:pPr>
+    </w:p>
+    <w:p>
+      <w:pPr>
+        <w:rPr>
+          <w:lang w:val="ru-RU"/>
+        </w:rPr>
+      </w:pPr>
+    </w:p>
+    <w:p>
+      <w:pPr>
+        <w:rPr>
+          <w:lang w:val="ru-RU"/>
         </w:rPr>
       </w:pPr>
     </w:p>
@@ -7105,6 +8802,7 @@
           <w:b/>
           <w:lang w:val="en-US"/>
         </w:rPr>
+        <w:lastRenderedPageBreak/>
         <w:t>Endpoint: /consumer</w:t>
       </w:r>
     </w:p>
@@ -7715,7 +9413,56 @@
     <w:p>
       <w:pPr>
         <w:rPr>
-          <w:lang w:val="en-US"/>
+          <w:lang w:val="ru-RU"/>
+        </w:rPr>
+      </w:pPr>
+    </w:p>
+    <w:p>
+      <w:pPr>
+        <w:rPr>
+          <w:lang w:val="ru-RU"/>
+        </w:rPr>
+      </w:pPr>
+    </w:p>
+    <w:p>
+      <w:pPr>
+        <w:rPr>
+          <w:lang w:val="ru-RU"/>
+        </w:rPr>
+      </w:pPr>
+    </w:p>
+    <w:p>
+      <w:pPr>
+        <w:rPr>
+          <w:lang w:val="ru-RU"/>
+        </w:rPr>
+      </w:pPr>
+    </w:p>
+    <w:p>
+      <w:pPr>
+        <w:rPr>
+          <w:lang w:val="ru-RU"/>
+        </w:rPr>
+      </w:pPr>
+    </w:p>
+    <w:p>
+      <w:pPr>
+        <w:rPr>
+          <w:lang w:val="ru-RU"/>
+        </w:rPr>
+      </w:pPr>
+    </w:p>
+    <w:p>
+      <w:pPr>
+        <w:rPr>
+          <w:lang w:val="ru-RU"/>
+        </w:rPr>
+      </w:pPr>
+    </w:p>
+    <w:p>
+      <w:pPr>
+        <w:rPr>
+          <w:lang w:val="ru-RU"/>
         </w:rPr>
       </w:pPr>
     </w:p>
@@ -7734,6 +9481,7 @@
           <w:b/>
           <w:lang w:val="en-US"/>
         </w:rPr>
+        <w:lastRenderedPageBreak/>
         <w:t>ProducerController</w:t>
       </w:r>
       <w:proofErr w:type="spellEnd"/>
@@ -7848,7 +9596,7 @@
                     </pic:cNvPicPr>
                   </pic:nvPicPr>
                   <pic:blipFill>
-                    <a:blip r:embed="rId14">
+                    <a:blip r:embed="rId20">
                       <a:extLst>
                         <a:ext uri="{28A0092B-C50C-407E-A947-70E740481C1C}">
                           <a14:useLocalDpi xmlns:a14="http://schemas.microsoft.com/office/drawing/2010/main" val="0"/>
@@ -8238,6 +9986,7 @@
           <w:rFonts w:asciiTheme="minorHAnsi" w:hAnsiTheme="minorHAnsi" w:cstheme="minorHAnsi"/>
           <w:lang w:val="en-US"/>
         </w:rPr>
+        <w:lastRenderedPageBreak/>
         <w:t xml:space="preserve">The </w:t>
       </w:r>
       <w:proofErr w:type="spellStart"/>
@@ -8445,7 +10194,6 @@
           <w:noProof/>
           <w:lang w:val="ru-RU" w:eastAsia="ru-RU"/>
         </w:rPr>
-        <w:lastRenderedPageBreak/>
         <w:drawing>
           <wp:inline distT="0" distB="0" distL="0" distR="0" wp14:anchorId="0FE103C9" wp14:editId="465AEDD7">
             <wp:extent cx="5357611" cy="3783276"/>
@@ -8464,7 +10212,7 @@
                     </pic:cNvPicPr>
                   </pic:nvPicPr>
                   <pic:blipFill>
-                    <a:blip r:embed="rId15">
+                    <a:blip r:embed="rId21">
                       <a:extLst>
                         <a:ext uri="{28A0092B-C50C-407E-A947-70E740481C1C}">
                           <a14:useLocalDpi xmlns:a14="http://schemas.microsoft.com/office/drawing/2010/main" val="0"/>
@@ -8634,6 +10382,7 @@
           <w:b/>
           <w:lang w:val="en-US"/>
         </w:rPr>
+        <w:lastRenderedPageBreak/>
         <w:t>Method:</w:t>
       </w:r>
       <w:r>
@@ -9274,14 +11023,14 @@
           <w:lang w:val="en-US"/>
         </w:rPr>
       </w:pPr>
-      <w:bookmarkStart w:id="26" w:name="_Toc172724908"/>
+      <w:bookmarkStart w:id="27" w:name="_Toc172725620"/>
       <w:r>
         <w:rPr>
           <w:lang w:val="en-US"/>
         </w:rPr>
         <w:t>Services</w:t>
       </w:r>
-      <w:bookmarkEnd w:id="26"/>
+      <w:bookmarkEnd w:id="27"/>
       <w:r>
         <w:rPr>
           <w:lang w:val="en-US"/>
@@ -9352,7 +11101,15 @@
           <w:rFonts w:asciiTheme="minorHAnsi" w:hAnsiTheme="minorHAnsi" w:cstheme="minorHAnsi"/>
           <w:lang w:val="en-US"/>
         </w:rPr>
-        <w:t xml:space="preserve"> service responsible for managing user authentication in the frontend. It achieves this by loading user credentials from a file and verifying login attempts using secure password hashing.</w:t>
+        <w:t xml:space="preserve"> service responsible for managing user authentication in </w:t>
+      </w:r>
+      <w:r>
+        <w:rPr>
+          <w:rFonts w:asciiTheme="minorHAnsi" w:hAnsiTheme="minorHAnsi" w:cstheme="minorHAnsi"/>
+          <w:lang w:val="en-US"/>
+        </w:rPr>
+        <w:lastRenderedPageBreak/>
+        <w:t>the frontend. It achieves this by loading user credentials from a file and verifying login attempts using secure password hashing.</w:t>
       </w:r>
     </w:p>
     <w:p>
@@ -9572,7 +11329,6 @@
           <w:rFonts w:asciiTheme="minorHAnsi" w:hAnsiTheme="minorHAnsi" w:cstheme="minorHAnsi"/>
           <w:lang w:val="en-US"/>
         </w:rPr>
-        <w:lastRenderedPageBreak/>
         <w:t>Annotation: @</w:t>
       </w:r>
       <w:proofErr w:type="spellStart"/>
@@ -10069,6 +11825,7 @@
           <w:rFonts w:asciiTheme="minorHAnsi" w:hAnsiTheme="minorHAnsi" w:cstheme="minorHAnsi"/>
           <w:lang w:val="en-US"/>
         </w:rPr>
+        <w:lastRenderedPageBreak/>
         <w:t xml:space="preserve">Purpose: Initializes and returns a new SSE emitter for </w:t>
       </w:r>
       <w:proofErr w:type="gramStart"/>
@@ -10153,7 +11910,7 @@
                     <pic:cNvPicPr/>
                   </pic:nvPicPr>
                   <pic:blipFill>
-                    <a:blip r:embed="rId16"/>
+                    <a:blip r:embed="rId22"/>
                     <a:stretch>
                       <a:fillRect/>
                     </a:stretch>
@@ -10194,7 +11951,6 @@
           <w:rFonts w:asciiTheme="minorHAnsi" w:hAnsiTheme="minorHAnsi" w:cstheme="minorHAnsi"/>
           <w:i/>
         </w:rPr>
-        <w:lastRenderedPageBreak/>
         <w:t>addWebClientEmitter</w:t>
       </w:r>
       <w:proofErr w:type="spellEnd"/>
@@ -10437,7 +12193,7 @@
                     <pic:cNvPicPr/>
                   </pic:nvPicPr>
                   <pic:blipFill>
-                    <a:blip r:embed="rId17">
+                    <a:blip r:embed="rId23">
                       <a:extLst>
                         <a:ext uri="{28A0092B-C50C-407E-A947-70E740481C1C}">
                           <a14:useLocalDpi xmlns:a14="http://schemas.microsoft.com/office/drawing/2010/main" val="0"/>
@@ -10652,6 +12408,7 @@
           <w:rFonts w:asciiTheme="minorHAnsi" w:hAnsiTheme="minorHAnsi" w:cstheme="minorHAnsi"/>
           <w:lang w:val="en-US"/>
         </w:rPr>
+        <w:lastRenderedPageBreak/>
         <w:t xml:space="preserve">Parameters: </w:t>
       </w:r>
       <w:proofErr w:type="spellStart"/>
@@ -10841,7 +12598,6 @@
           <w:rFonts w:asciiTheme="minorHAnsi" w:hAnsiTheme="minorHAnsi" w:cstheme="minorHAnsi"/>
           <w:lang w:val="en-US"/>
         </w:rPr>
-        <w:lastRenderedPageBreak/>
         <w:t xml:space="preserve">The </w:t>
       </w:r>
       <w:proofErr w:type="spellStart"/>
@@ -11313,7 +13069,7 @@
                     <pic:cNvPicPr/>
                   </pic:nvPicPr>
                   <pic:blipFill>
-                    <a:blip r:embed="rId18"/>
+                    <a:blip r:embed="rId24"/>
                     <a:stretch>
                       <a:fillRect/>
                     </a:stretch>
@@ -11562,7 +13318,7 @@
                     <pic:cNvPicPr/>
                   </pic:nvPicPr>
                   <pic:blipFill>
-                    <a:blip r:embed="rId19"/>
+                    <a:blip r:embed="rId25"/>
                     <a:stretch>
                       <a:fillRect/>
                     </a:stretch>
@@ -12111,7 +13867,7 @@
                     <pic:cNvPicPr/>
                   </pic:nvPicPr>
                   <pic:blipFill>
-                    <a:blip r:embed="rId20"/>
+                    <a:blip r:embed="rId26"/>
                     <a:stretch>
                       <a:fillRect/>
                     </a:stretch>
@@ -13214,7 +14970,7 @@
                     <pic:cNvPicPr/>
                   </pic:nvPicPr>
                   <pic:blipFill>
-                    <a:blip r:embed="rId21"/>
+                    <a:blip r:embed="rId27"/>
                     <a:stretch>
                       <a:fillRect/>
                     </a:stretch>
@@ -13444,7 +15200,7 @@
                     <pic:cNvPicPr/>
                   </pic:nvPicPr>
                   <pic:blipFill>
-                    <a:blip r:embed="rId22"/>
+                    <a:blip r:embed="rId28"/>
                     <a:stretch>
                       <a:fillRect/>
                     </a:stretch>
@@ -14328,7 +16084,7 @@
                     <pic:cNvPicPr/>
                   </pic:nvPicPr>
                   <pic:blipFill>
-                    <a:blip r:embed="rId23"/>
+                    <a:blip r:embed="rId29"/>
                     <a:stretch>
                       <a:fillRect/>
                     </a:stretch>
@@ -14624,7 +16380,7 @@
                     <pic:cNvPicPr/>
                   </pic:nvPicPr>
                   <pic:blipFill>
-                    <a:blip r:embed="rId24"/>
+                    <a:blip r:embed="rId30"/>
                     <a:stretch>
                       <a:fillRect/>
                     </a:stretch>
@@ -14647,6 +16403,26 @@
     </w:p>
     <w:p>
       <w:pPr>
+        <w:widowControl/>
+        <w:spacing w:before="0" w:after="160" w:line="259" w:lineRule="auto"/>
+        <w:rPr>
+          <w:rFonts w:asciiTheme="minorHAnsi" w:hAnsiTheme="minorHAnsi" w:cstheme="minorHAnsi"/>
+          <w:lang w:val="ru-RU"/>
+        </w:rPr>
+      </w:pPr>
+    </w:p>
+    <w:p>
+      <w:pPr>
+        <w:widowControl/>
+        <w:spacing w:before="0" w:after="160" w:line="259" w:lineRule="auto"/>
+        <w:rPr>
+          <w:rFonts w:asciiTheme="minorHAnsi" w:hAnsiTheme="minorHAnsi" w:cstheme="minorHAnsi"/>
+          <w:lang w:val="en-US"/>
+        </w:rPr>
+      </w:pPr>
+    </w:p>
+    <w:p>
+      <w:pPr>
         <w:pStyle w:val="3"/>
         <w:numPr>
           <w:ilvl w:val="2"/>
@@ -14656,14 +16432,15 @@
           <w:lang w:val="en-US"/>
         </w:rPr>
       </w:pPr>
-      <w:bookmarkStart w:id="27" w:name="_Toc172724909"/>
-      <w:r>
-        <w:rPr>
-          <w:lang w:val="en-US"/>
-        </w:rPr>
+      <w:bookmarkStart w:id="28" w:name="_Toc172725621"/>
+      <w:r>
+        <w:rPr>
+          <w:lang w:val="en-US"/>
+        </w:rPr>
+        <w:lastRenderedPageBreak/>
         <w:t>How the Server Handles Camera Commands</w:t>
       </w:r>
-      <w:bookmarkEnd w:id="27"/>
+      <w:bookmarkEnd w:id="28"/>
     </w:p>
     <w:p>
       <w:pPr>
@@ -14693,15 +16470,7 @@
           <w:rFonts w:ascii="Times New Roman" w:hAnsi="Times New Roman" w:cs="Times New Roman"/>
           <w:lang w:val="en-US"/>
         </w:rPr>
-        <w:t xml:space="preserve"> whether they need to be sent to the "Organ Sequencer" component for execution, receive information from the "Organ Sequencer" about the piece being played, send information for </w:t>
-      </w:r>
-      <w:r>
-        <w:rPr>
-          <w:rFonts w:ascii="Times New Roman" w:hAnsi="Times New Roman" w:cs="Times New Roman"/>
-          <w:lang w:val="en-US"/>
-        </w:rPr>
-        <w:lastRenderedPageBreak/>
-        <w:t>display on the frontend, as well as store credentials and verify them for frontend login.</w:t>
+        <w:t xml:space="preserve"> whether they need to be sent to the "Organ Sequencer" component for execution, receive information from the "Organ Sequencer" about the piece being played, send information for display on the frontend, as well as store credentials and verify them for frontend login.</w:t>
       </w:r>
     </w:p>
     <w:p>
@@ -14745,7 +16514,7 @@
                     </pic:cNvPicPr>
                   </pic:nvPicPr>
                   <pic:blipFill>
-                    <a:blip r:embed="rId25">
+                    <a:blip r:embed="rId31">
                       <a:extLst>
                         <a:ext uri="{28A0092B-C50C-407E-A947-70E740481C1C}">
                           <a14:useLocalDpi xmlns:a14="http://schemas.microsoft.com/office/drawing/2010/main" val="0"/>
@@ -14842,7 +16611,7 @@
       </w:pPr>
     </w:p>
     <w:sectPr>
-      <w:footerReference w:type="default" r:id="rId26"/>
+      <w:footerReference w:type="default" r:id="rId32"/>
       <w:pgSz w:w="12240" w:h="15840"/>
       <w:pgMar w:top="1440" w:right="1440" w:bottom="1440" w:left="1440" w:header="0" w:footer="0" w:gutter="0"/>
       <w:pgNumType w:start="1"/>
@@ -14897,7 +16666,7 @@
       <w:rPr>
         <w:noProof/>
       </w:rPr>
-      <w:t>7</w:t>
+      <w:t>2</w:t>
     </w:r>
     <w:r>
       <w:fldChar w:fldCharType="end"/>
@@ -21357,6 +23126,18 @@
       <w:szCs w:val="24"/>
     </w:rPr>
   </w:style>
+  <w:style w:type="character" w:styleId="HTML">
+    <w:name w:val="HTML Code"/>
+    <w:basedOn w:val="a0"/>
+    <w:uiPriority w:val="99"/>
+    <w:unhideWhenUsed/>
+    <w:rsid w:val="00FF73FE"/>
+    <w:rPr>
+      <w:rFonts w:ascii="Courier New" w:eastAsia="Times New Roman" w:hAnsi="Courier New" w:cs="Courier New"/>
+      <w:sz w:val="20"/>
+      <w:szCs w:val="20"/>
+    </w:rPr>
+  </w:style>
 </w:styles>
 </file>
 
@@ -21798,6 +23579,18 @@
       <w:szCs w:val="24"/>
     </w:rPr>
   </w:style>
+  <w:style w:type="character" w:styleId="HTML">
+    <w:name w:val="HTML Code"/>
+    <w:basedOn w:val="a0"/>
+    <w:uiPriority w:val="99"/>
+    <w:unhideWhenUsed/>
+    <w:rsid w:val="00FF73FE"/>
+    <w:rPr>
+      <w:rFonts w:ascii="Courier New" w:eastAsia="Times New Roman" w:hAnsi="Courier New" w:cs="Courier New"/>
+      <w:sz w:val="20"/>
+      <w:szCs w:val="20"/>
+    </w:rPr>
+  </w:style>
 </w:styles>
 </file>
 
@@ -22065,7 +23858,7 @@
 </file>
 
 <file path=customXml/itemProps1.xml><?xml version="1.0" encoding="utf-8"?>
-<ds:datastoreItem xmlns:ds="http://schemas.openxmlformats.org/officeDocument/2006/customXml" ds:itemID="{31685716-6D42-42D5-A308-3F1503B6EC80}">
+<ds:datastoreItem xmlns:ds="http://schemas.openxmlformats.org/officeDocument/2006/customXml" ds:itemID="{D2CAF72B-881F-4EEE-8A66-B596E788554A}">
   <ds:schemaRefs>
     <ds:schemaRef ds:uri="http://schemas.openxmlformats.org/officeDocument/2006/bibliography"/>
   </ds:schemaRefs>

</xml_diff>